<commit_message>
final version of dc
</commit_message>
<xml_diff>
--- a/My project/Dolezal_Bakalarska-prace.docx
+++ b/My project/Dolezal_Bakalarska-prace.docx
@@ -1179,7 +1179,6 @@
       <w:pPr>
         <w:spacing w:line="360" w:lineRule="auto"/>
         <w:sectPr>
-          <w:footerReference w:type="default" r:id="rId9"/>
           <w:pgSz w:w="11907" w:h="16839" w:code="9"/>
           <w:pgMar w:top="1701" w:right="1134" w:bottom="1418" w:left="1985" w:header="709" w:footer="709" w:gutter="0"/>
           <w:pgNumType w:start="1"/>
@@ -7253,7 +7252,7 @@
       <w:r>
         <w:t xml:space="preserve">. Mezi nejznámější tituly vytvořené pomocí tohoto enginu patří </w:t>
       </w:r>
-      <w:hyperlink r:id="rId13" w:history="1">
+      <w:hyperlink r:id="rId12" w:history="1">
         <w:r>
           <w:rPr>
             <w:rStyle w:val="Hypertextovodkaz"/>
@@ -7760,7 +7759,7 @@
                                 <w:szCs w:val="24"/>
                               </w:rPr>
                             </w:pPr>
-                            <w:bookmarkStart w:id="20" w:name="_Toc159173549"/>
+                            <w:bookmarkStart w:id="20" w:name="_Toc159952203"/>
                             <w:r>
                               <w:rPr>
                                 <w:i w:val="0"/>
@@ -7915,7 +7914,7 @@
                           <w:szCs w:val="24"/>
                         </w:rPr>
                       </w:pPr>
-                      <w:bookmarkStart w:id="21" w:name="_Toc159173549"/>
+                      <w:bookmarkStart w:id="21" w:name="_Toc159952203"/>
                       <w:r>
                         <w:rPr>
                           <w:i w:val="0"/>
@@ -8073,7 +8072,7 @@
                     <pic:cNvPicPr/>
                   </pic:nvPicPr>
                   <pic:blipFill>
-                    <a:blip r:embed="rId14">
+                    <a:blip r:embed="rId13">
                       <a:extLst>
                         <a:ext uri="{28A0092B-C50C-407E-A947-70E740481C1C}">
                           <a14:useLocalDpi xmlns:a14="http://schemas.microsoft.com/office/drawing/2010/main" val="0"/>
@@ -8763,7 +8762,7 @@
                                 <w:szCs w:val="24"/>
                               </w:rPr>
                             </w:pPr>
-                            <w:bookmarkStart w:id="24" w:name="_Toc159173550"/>
+                            <w:bookmarkStart w:id="24" w:name="_Toc159952204"/>
                             <w:r>
                               <w:rPr>
                                 <w:i w:val="0"/>
@@ -8852,7 +8851,7 @@
                           <w:szCs w:val="24"/>
                         </w:rPr>
                       </w:pPr>
-                      <w:bookmarkStart w:id="25" w:name="_Toc159173550"/>
+                      <w:bookmarkStart w:id="25" w:name="_Toc159952204"/>
                       <w:r>
                         <w:rPr>
                           <w:i w:val="0"/>
@@ -8948,7 +8947,7 @@
                     <pic:cNvPicPr/>
                   </pic:nvPicPr>
                   <pic:blipFill>
-                    <a:blip r:embed="rId15">
+                    <a:blip r:embed="rId14">
                       <a:extLst>
                         <a:ext uri="{28A0092B-C50C-407E-A947-70E740481C1C}">
                           <a14:useLocalDpi xmlns:a14="http://schemas.microsoft.com/office/drawing/2010/main" val="0"/>
@@ -9548,7 +9547,7 @@
                                 <w:szCs w:val="24"/>
                               </w:rPr>
                             </w:pPr>
-                            <w:bookmarkStart w:id="28" w:name="_Toc159173551"/>
+                            <w:bookmarkStart w:id="28" w:name="_Toc159952205"/>
                             <w:r>
                               <w:rPr>
                                 <w:i w:val="0"/>
@@ -9716,7 +9715,7 @@
                           <w:szCs w:val="24"/>
                         </w:rPr>
                       </w:pPr>
-                      <w:bookmarkStart w:id="29" w:name="_Toc159173551"/>
+                      <w:bookmarkStart w:id="29" w:name="_Toc159952205"/>
                       <w:r>
                         <w:rPr>
                           <w:i w:val="0"/>
@@ -9888,7 +9887,7 @@
                     <pic:cNvPicPr/>
                   </pic:nvPicPr>
                   <pic:blipFill>
-                    <a:blip r:embed="rId16">
+                    <a:blip r:embed="rId15">
                       <a:extLst>
                         <a:ext uri="{28A0092B-C50C-407E-A947-70E740481C1C}">
                           <a14:useLocalDpi xmlns:a14="http://schemas.microsoft.com/office/drawing/2010/main" val="0"/>
@@ -10146,7 +10145,7 @@
                                 <w:szCs w:val="24"/>
                               </w:rPr>
                             </w:pPr>
-                            <w:bookmarkStart w:id="33" w:name="_Toc159173552"/>
+                            <w:bookmarkStart w:id="33" w:name="_Toc159952206"/>
                             <w:r>
                               <w:rPr>
                                 <w:i w:val="0"/>
@@ -10314,7 +10313,7 @@
                           <w:szCs w:val="24"/>
                         </w:rPr>
                       </w:pPr>
-                      <w:bookmarkStart w:id="34" w:name="_Toc159173552"/>
+                      <w:bookmarkStart w:id="34" w:name="_Toc159952206"/>
                       <w:r>
                         <w:rPr>
                           <w:i w:val="0"/>
@@ -10486,7 +10485,7 @@
                     <pic:cNvPicPr/>
                   </pic:nvPicPr>
                   <pic:blipFill>
-                    <a:blip r:embed="rId17">
+                    <a:blip r:embed="rId16">
                       <a:extLst>
                         <a:ext uri="{28A0092B-C50C-407E-A947-70E740481C1C}">
                           <a14:useLocalDpi xmlns:a14="http://schemas.microsoft.com/office/drawing/2010/main" val="0"/>
@@ -11075,7 +11074,7 @@
                                 <w:szCs w:val="24"/>
                               </w:rPr>
                             </w:pPr>
-                            <w:bookmarkStart w:id="39" w:name="_Toc159173553"/>
+                            <w:bookmarkStart w:id="39" w:name="_Toc159952207"/>
                             <w:r>
                               <w:rPr>
                                 <w:i w:val="0"/>
@@ -11181,7 +11180,7 @@
                           <w:szCs w:val="24"/>
                         </w:rPr>
                       </w:pPr>
-                      <w:bookmarkStart w:id="40" w:name="_Toc159173553"/>
+                      <w:bookmarkStart w:id="40" w:name="_Toc159952207"/>
                       <w:r>
                         <w:rPr>
                           <w:i w:val="0"/>
@@ -11292,7 +11291,7 @@
                     <pic:cNvPicPr/>
                   </pic:nvPicPr>
                   <pic:blipFill>
-                    <a:blip r:embed="rId18">
+                    <a:blip r:embed="rId17">
                       <a:extLst>
                         <a:ext uri="{28A0092B-C50C-407E-A947-70E740481C1C}">
                           <a14:useLocalDpi xmlns:a14="http://schemas.microsoft.com/office/drawing/2010/main" val="0"/>
@@ -11495,7 +11494,7 @@
                                 <w:szCs w:val="24"/>
                               </w:rPr>
                             </w:pPr>
-                            <w:bookmarkStart w:id="43" w:name="_Toc159173554"/>
+                            <w:bookmarkStart w:id="43" w:name="_Toc159952208"/>
                             <w:r>
                               <w:rPr>
                                 <w:i w:val="0"/>
@@ -11656,7 +11655,7 @@
                           <w:szCs w:val="24"/>
                         </w:rPr>
                       </w:pPr>
-                      <w:bookmarkStart w:id="44" w:name="_Toc159173554"/>
+                      <w:bookmarkStart w:id="44" w:name="_Toc159952208"/>
                       <w:r>
                         <w:rPr>
                           <w:i w:val="0"/>
@@ -11821,7 +11820,7 @@
                     <pic:cNvPicPr/>
                   </pic:nvPicPr>
                   <pic:blipFill>
-                    <a:blip r:embed="rId19">
+                    <a:blip r:embed="rId18">
                       <a:extLst>
                         <a:ext uri="{28A0092B-C50C-407E-A947-70E740481C1C}">
                           <a14:useLocalDpi xmlns:a14="http://schemas.microsoft.com/office/drawing/2010/main" val="0"/>
@@ -12948,7 +12947,7 @@
                                 <w:szCs w:val="24"/>
                               </w:rPr>
                             </w:pPr>
-                            <w:bookmarkStart w:id="49" w:name="_Toc159173555"/>
+                            <w:bookmarkStart w:id="49" w:name="_Toc159952209"/>
                             <w:r>
                               <w:rPr>
                                 <w:i w:val="0"/>
@@ -13109,7 +13108,7 @@
                           <w:szCs w:val="24"/>
                         </w:rPr>
                       </w:pPr>
-                      <w:bookmarkStart w:id="50" w:name="_Toc159173555"/>
+                      <w:bookmarkStart w:id="50" w:name="_Toc159952209"/>
                       <w:r>
                         <w:rPr>
                           <w:i w:val="0"/>
@@ -13274,7 +13273,7 @@
                     <pic:cNvPicPr/>
                   </pic:nvPicPr>
                   <pic:blipFill>
-                    <a:blip r:embed="rId20">
+                    <a:blip r:embed="rId19">
                       <a:extLst>
                         <a:ext uri="{28A0092B-C50C-407E-A947-70E740481C1C}">
                           <a14:useLocalDpi xmlns:a14="http://schemas.microsoft.com/office/drawing/2010/main" val="0"/>
@@ -13724,7 +13723,7 @@
                                 <w:szCs w:val="24"/>
                               </w:rPr>
                             </w:pPr>
-                            <w:bookmarkStart w:id="51" w:name="_Toc159173556"/>
+                            <w:bookmarkStart w:id="51" w:name="_Toc159952210"/>
                             <w:r>
                               <w:rPr>
                                 <w:i w:val="0"/>
@@ -13878,7 +13877,7 @@
                           <w:szCs w:val="24"/>
                         </w:rPr>
                       </w:pPr>
-                      <w:bookmarkStart w:id="52" w:name="_Toc159173556"/>
+                      <w:bookmarkStart w:id="52" w:name="_Toc159952210"/>
                       <w:r>
                         <w:rPr>
                           <w:i w:val="0"/>
@@ -14036,7 +14035,7 @@
                     <pic:cNvPicPr/>
                   </pic:nvPicPr>
                   <pic:blipFill>
-                    <a:blip r:embed="rId21">
+                    <a:blip r:embed="rId20">
                       <a:extLst>
                         <a:ext uri="{28A0092B-C50C-407E-A947-70E740481C1C}">
                           <a14:useLocalDpi xmlns:a14="http://schemas.microsoft.com/office/drawing/2010/main" val="0"/>
@@ -14134,7 +14133,7 @@
                                 <w:szCs w:val="24"/>
                               </w:rPr>
                             </w:pPr>
-                            <w:bookmarkStart w:id="53" w:name="_Toc159173557"/>
+                            <w:bookmarkStart w:id="53" w:name="_Toc159952211"/>
                             <w:r>
                               <w:rPr>
                                 <w:i w:val="0"/>
@@ -14271,7 +14270,7 @@
                           <w:szCs w:val="24"/>
                         </w:rPr>
                       </w:pPr>
-                      <w:bookmarkStart w:id="54" w:name="_Toc159173557"/>
+                      <w:bookmarkStart w:id="54" w:name="_Toc159952211"/>
                       <w:r>
                         <w:rPr>
                           <w:i w:val="0"/>
@@ -14415,7 +14414,7 @@
                     <pic:cNvPicPr/>
                   </pic:nvPicPr>
                   <pic:blipFill>
-                    <a:blip r:embed="rId22">
+                    <a:blip r:embed="rId21">
                       <a:extLst>
                         <a:ext uri="{28A0092B-C50C-407E-A947-70E740481C1C}">
                           <a14:useLocalDpi xmlns:a14="http://schemas.microsoft.com/office/drawing/2010/main" val="0"/>
@@ -14697,7 +14696,7 @@
                                 <w:szCs w:val="24"/>
                               </w:rPr>
                             </w:pPr>
-                            <w:bookmarkStart w:id="57" w:name="_Toc159173558"/>
+                            <w:bookmarkStart w:id="57" w:name="_Toc159952212"/>
                             <w:r>
                               <w:rPr>
                                 <w:i w:val="0"/>
@@ -14848,7 +14847,7 @@
                           <w:szCs w:val="24"/>
                         </w:rPr>
                       </w:pPr>
-                      <w:bookmarkStart w:id="58" w:name="_Toc159173558"/>
+                      <w:bookmarkStart w:id="58" w:name="_Toc159952212"/>
                       <w:r>
                         <w:rPr>
                           <w:i w:val="0"/>
@@ -15006,7 +15005,7 @@
                     <pic:cNvPicPr/>
                   </pic:nvPicPr>
                   <pic:blipFill>
-                    <a:blip r:embed="rId23">
+                    <a:blip r:embed="rId22">
                       <a:extLst>
                         <a:ext uri="{28A0092B-C50C-407E-A947-70E740481C1C}">
                           <a14:useLocalDpi xmlns:a14="http://schemas.microsoft.com/office/drawing/2010/main" val="0"/>
@@ -15391,7 +15390,7 @@
                                 <w:szCs w:val="24"/>
                               </w:rPr>
                             </w:pPr>
-                            <w:bookmarkStart w:id="61" w:name="_Toc159173559"/>
+                            <w:bookmarkStart w:id="61" w:name="_Toc159952213"/>
                             <w:r>
                               <w:rPr>
                                 <w:i w:val="0"/>
@@ -15511,7 +15510,7 @@
                           <w:szCs w:val="24"/>
                         </w:rPr>
                       </w:pPr>
-                      <w:bookmarkStart w:id="62" w:name="_Toc159173559"/>
+                      <w:bookmarkStart w:id="62" w:name="_Toc159952213"/>
                       <w:r>
                         <w:rPr>
                           <w:i w:val="0"/>
@@ -15635,7 +15634,7 @@
                     <pic:cNvPicPr/>
                   </pic:nvPicPr>
                   <pic:blipFill>
-                    <a:blip r:embed="rId24">
+                    <a:blip r:embed="rId23">
                       <a:extLst>
                         <a:ext uri="{28A0092B-C50C-407E-A947-70E740481C1C}">
                           <a14:useLocalDpi xmlns:a14="http://schemas.microsoft.com/office/drawing/2010/main" val="0"/>
@@ -15752,7 +15751,13 @@
         <w:jc w:val="both"/>
       </w:pPr>
       <w:r>
-        <w:t>Color – nám dovoluje nastavit barvu všech dlaždic v </w:t>
+        <w:t>Color –</w:t>
+      </w:r>
+      <w:r>
+        <w:t xml:space="preserve"> </w:t>
+      </w:r>
+      <w:r>
+        <w:t>dovoluje nastavit barvu všech dlaždic v </w:t>
       </w:r>
       <w:r>
         <w:t>T</w:t>
@@ -15836,7 +15841,7 @@
                                 <w:szCs w:val="24"/>
                               </w:rPr>
                             </w:pPr>
-                            <w:bookmarkStart w:id="63" w:name="_Toc159173560"/>
+                            <w:bookmarkStart w:id="63" w:name="_Toc159952214"/>
                             <w:r>
                               <w:rPr>
                                 <w:i w:val="0"/>
@@ -15939,7 +15944,7 @@
                           <w:szCs w:val="24"/>
                         </w:rPr>
                       </w:pPr>
-                      <w:bookmarkStart w:id="64" w:name="_Toc159173560"/>
+                      <w:bookmarkStart w:id="64" w:name="_Toc159952214"/>
                       <w:r>
                         <w:rPr>
                           <w:i w:val="0"/>
@@ -16049,7 +16054,7 @@
                     <pic:cNvPicPr/>
                   </pic:nvPicPr>
                   <pic:blipFill>
-                    <a:blip r:embed="rId25">
+                    <a:blip r:embed="rId24">
                       <a:extLst>
                         <a:ext uri="{28A0092B-C50C-407E-A947-70E740481C1C}">
                           <a14:useLocalDpi xmlns:a14="http://schemas.microsoft.com/office/drawing/2010/main" val="0"/>
@@ -16116,7 +16121,19 @@
         <w:jc w:val="both"/>
       </w:pPr>
       <w:r>
-        <w:t xml:space="preserve">K použití Tilemaps potřebujeme </w:t>
+        <w:t xml:space="preserve">K použití Tilemaps </w:t>
+      </w:r>
+      <w:r>
+        <w:t xml:space="preserve">je </w:t>
+      </w:r>
+      <w:r>
+        <w:t>potřeb</w:t>
+      </w:r>
+      <w:r>
+        <w:t>a</w:t>
+      </w:r>
+      <w:r>
+        <w:t xml:space="preserve"> </w:t>
       </w:r>
       <w:r>
         <w:t xml:space="preserve">také </w:t>
@@ -16196,7 +16213,7 @@
                     <pic:cNvPicPr/>
                   </pic:nvPicPr>
                   <pic:blipFill>
-                    <a:blip r:embed="rId26">
+                    <a:blip r:embed="rId25">
                       <a:extLst>
                         <a:ext uri="{28A0092B-C50C-407E-A947-70E740481C1C}">
                           <a14:useLocalDpi xmlns:a14="http://schemas.microsoft.com/office/drawing/2010/main" val="0"/>
@@ -16339,7 +16356,7 @@
                                 <w:szCs w:val="24"/>
                               </w:rPr>
                             </w:pPr>
-                            <w:bookmarkStart w:id="65" w:name="_Toc159173561"/>
+                            <w:bookmarkStart w:id="65" w:name="_Toc159952215"/>
                             <w:r>
                               <w:rPr>
                                 <w:i w:val="0"/>
@@ -16456,7 +16473,7 @@
                           <w:szCs w:val="24"/>
                         </w:rPr>
                       </w:pPr>
-                      <w:bookmarkStart w:id="66" w:name="_Toc159173561"/>
+                      <w:bookmarkStart w:id="66" w:name="_Toc159952215"/>
                       <w:r>
                         <w:rPr>
                           <w:i w:val="0"/>
@@ -16679,7 +16696,7 @@
                                 <w:szCs w:val="24"/>
                               </w:rPr>
                             </w:pPr>
-                            <w:bookmarkStart w:id="67" w:name="_Toc159173562"/>
+                            <w:bookmarkStart w:id="67" w:name="_Toc159952216"/>
                             <w:r>
                               <w:rPr>
                                 <w:i w:val="0"/>
@@ -16830,7 +16847,7 @@
                           <w:szCs w:val="24"/>
                         </w:rPr>
                       </w:pPr>
-                      <w:bookmarkStart w:id="68" w:name="_Toc159173562"/>
+                      <w:bookmarkStart w:id="68" w:name="_Toc159952216"/>
                       <w:r>
                         <w:rPr>
                           <w:i w:val="0"/>
@@ -16988,7 +17005,7 @@
                     <pic:cNvPicPr/>
                   </pic:nvPicPr>
                   <pic:blipFill>
-                    <a:blip r:embed="rId27">
+                    <a:blip r:embed="rId26">
                       <a:extLst>
                         <a:ext uri="{28A0092B-C50C-407E-A947-70E740481C1C}">
                           <a14:useLocalDpi xmlns:a14="http://schemas.microsoft.com/office/drawing/2010/main" val="0"/>
@@ -17132,7 +17149,7 @@
       <w:r>
         <w:t xml:space="preserve">Dle </w:t>
       </w:r>
-      <w:hyperlink r:id="rId28" w:history="1">
+      <w:hyperlink r:id="rId27" w:history="1">
         <w:r>
           <w:rPr>
             <w:rStyle w:val="Hypertextovodkaz"/>
@@ -17208,7 +17225,7 @@
       <w:r>
         <w:t xml:space="preserve"> jiného článku od autorů </w:t>
       </w:r>
-      <w:hyperlink r:id="rId29" w:history="1">
+      <w:hyperlink r:id="rId28" w:history="1">
         <w:r>
           <w:rPr>
             <w:rStyle w:val="Hypertextovodkaz"/>
@@ -17221,7 +17238,7 @@
       <w:r>
         <w:t>a a </w:t>
       </w:r>
-      <w:hyperlink r:id="rId30" w:history="1">
+      <w:hyperlink r:id="rId29" w:history="1">
         <w:r>
           <w:rPr>
             <w:rStyle w:val="Hypertextovodkaz"/>
@@ -17235,9 +17252,6 @@
         <w:t>a</w:t>
       </w:r>
       <w:r>
-        <w:rPr>
-          <w:u w:val="single"/>
-        </w:rPr>
         <w:t xml:space="preserve"> </w:t>
       </w:r>
       <w:r>
@@ -17281,7 +17295,13 @@
         <w:t xml:space="preserve">V následující tabulce je </w:t>
       </w:r>
       <w:r>
-        <w:t xml:space="preserve">uvdene subjektivní porovnání autora z podle </w:t>
+        <w:t>uv</w:t>
+      </w:r>
+      <w:r>
+        <w:t>e</w:t>
+      </w:r>
+      <w:r>
+        <w:t xml:space="preserve">den subjektivní porovnání autora z podle </w:t>
       </w:r>
       <w:r>
         <w:t>předností a nedostatků jednotlivých enginů z předchozích kapitol, kde hodnota pět značí nejlepší a hodnota jedna nejhorší.</w:t>
@@ -18099,7 +18119,7 @@
           <w:szCs w:val="20"/>
         </w:rPr>
       </w:pPr>
-      <w:bookmarkStart w:id="74" w:name="_Toc159173592"/>
+      <w:bookmarkStart w:id="74" w:name="_Toc159952194"/>
       <w:r>
         <w:rPr>
           <w:i w:val="0"/>
@@ -18495,7 +18515,7 @@
                                 <w:szCs w:val="24"/>
                               </w:rPr>
                             </w:pPr>
-                            <w:bookmarkStart w:id="80" w:name="_Toc159173563"/>
+                            <w:bookmarkStart w:id="80" w:name="_Toc159952217"/>
                             <w:r>
                               <w:rPr>
                                 <w:i w:val="0"/>
@@ -18600,7 +18620,7 @@
                           <w:szCs w:val="24"/>
                         </w:rPr>
                       </w:pPr>
-                      <w:bookmarkStart w:id="81" w:name="_Toc159173563"/>
+                      <w:bookmarkStart w:id="81" w:name="_Toc159952217"/>
                       <w:r>
                         <w:rPr>
                           <w:i w:val="0"/>
@@ -18711,7 +18731,7 @@
                     <pic:cNvPicPr/>
                   </pic:nvPicPr>
                   <pic:blipFill>
-                    <a:blip r:embed="rId31">
+                    <a:blip r:embed="rId30">
                       <a:extLst>
                         <a:ext uri="{28A0092B-C50C-407E-A947-70E740481C1C}">
                           <a14:useLocalDpi xmlns:a14="http://schemas.microsoft.com/office/drawing/2010/main" val="0"/>
@@ -19007,7 +19027,7 @@
                                 <w:szCs w:val="24"/>
                               </w:rPr>
                             </w:pPr>
-                            <w:bookmarkStart w:id="85" w:name="_Toc159173564"/>
+                            <w:bookmarkStart w:id="85" w:name="_Toc159952218"/>
                             <w:r>
                               <w:rPr>
                                 <w:i w:val="0"/>
@@ -19104,7 +19124,7 @@
                           <w:szCs w:val="24"/>
                         </w:rPr>
                       </w:pPr>
-                      <w:bookmarkStart w:id="86" w:name="_Toc159173564"/>
+                      <w:bookmarkStart w:id="86" w:name="_Toc159952218"/>
                       <w:r>
                         <w:rPr>
                           <w:i w:val="0"/>
@@ -19207,7 +19227,7 @@
                     <pic:cNvPicPr/>
                   </pic:nvPicPr>
                   <pic:blipFill>
-                    <a:blip r:embed="rId33">
+                    <a:blip r:embed="rId32">
                       <a:extLst>
                         <a:ext uri="{28A0092B-C50C-407E-A947-70E740481C1C}">
                           <a14:useLocalDpi xmlns:a14="http://schemas.microsoft.com/office/drawing/2010/main" val="0"/>
@@ -24029,7 +24049,7 @@
           <w:szCs w:val="20"/>
         </w:rPr>
       </w:pPr>
-      <w:bookmarkStart w:id="92" w:name="_Toc159173593"/>
+      <w:bookmarkStart w:id="92" w:name="_Toc159952195"/>
       <w:r>
         <w:rPr>
           <w:i w:val="0"/>
@@ -24193,7 +24213,7 @@
                                 <w:szCs w:val="24"/>
                               </w:rPr>
                             </w:pPr>
-                            <w:bookmarkStart w:id="94" w:name="_Toc159173565"/>
+                            <w:bookmarkStart w:id="94" w:name="_Toc159952219"/>
                             <w:r>
                               <w:rPr>
                                 <w:i w:val="0"/>
@@ -24290,7 +24310,7 @@
                           <w:szCs w:val="24"/>
                         </w:rPr>
                       </w:pPr>
-                      <w:bookmarkStart w:id="95" w:name="_Toc159173565"/>
+                      <w:bookmarkStart w:id="95" w:name="_Toc159952219"/>
                       <w:r>
                         <w:rPr>
                           <w:i w:val="0"/>
@@ -24393,7 +24413,7 @@
                     <pic:cNvPicPr/>
                   </pic:nvPicPr>
                   <pic:blipFill>
-                    <a:blip r:embed="rId34">
+                    <a:blip r:embed="rId33">
                       <a:extLst>
                         <a:ext uri="{28A0092B-C50C-407E-A947-70E740481C1C}">
                           <a14:useLocalDpi xmlns:a14="http://schemas.microsoft.com/office/drawing/2010/main" val="0"/>
@@ -28038,7 +28058,7 @@
                     <pic:cNvPicPr/>
                   </pic:nvPicPr>
                   <pic:blipFill>
-                    <a:blip r:embed="rId35">
+                    <a:blip r:embed="rId34">
                       <a:extLst>
                         <a:ext uri="{28A0092B-C50C-407E-A947-70E740481C1C}">
                           <a14:useLocalDpi xmlns:a14="http://schemas.microsoft.com/office/drawing/2010/main" val="0"/>
@@ -28121,7 +28141,7 @@
                                 <w:szCs w:val="24"/>
                               </w:rPr>
                             </w:pPr>
-                            <w:bookmarkStart w:id="105" w:name="_Toc159173566"/>
+                            <w:bookmarkStart w:id="105" w:name="_Toc159952220"/>
                             <w:r>
                               <w:rPr>
                                 <w:i w:val="0"/>
@@ -28220,7 +28240,7 @@
                           <w:szCs w:val="24"/>
                         </w:rPr>
                       </w:pPr>
-                      <w:bookmarkStart w:id="106" w:name="_Toc159173566"/>
+                      <w:bookmarkStart w:id="106" w:name="_Toc159952220"/>
                       <w:r>
                         <w:rPr>
                           <w:i w:val="0"/>
@@ -29845,7 +29865,7 @@
                                 <w:szCs w:val="24"/>
                               </w:rPr>
                             </w:pPr>
-                            <w:bookmarkStart w:id="111" w:name="_Toc159173567"/>
+                            <w:bookmarkStart w:id="111" w:name="_Toc159952221"/>
                             <w:r>
                               <w:rPr>
                                 <w:i w:val="0"/>
@@ -29945,7 +29965,7 @@
                           <w:szCs w:val="24"/>
                         </w:rPr>
                       </w:pPr>
-                      <w:bookmarkStart w:id="112" w:name="_Toc159173567"/>
+                      <w:bookmarkStart w:id="112" w:name="_Toc159952221"/>
                       <w:r>
                         <w:rPr>
                           <w:i w:val="0"/>
@@ -30048,7 +30068,7 @@
                     <pic:cNvPicPr/>
                   </pic:nvPicPr>
                   <pic:blipFill>
-                    <a:blip r:embed="rId36" cstate="print">
+                    <a:blip r:embed="rId35" cstate="print">
                       <a:extLst>
                         <a:ext uri="{28A0092B-C50C-407E-A947-70E740481C1C}">
                           <a14:useLocalDpi xmlns:a14="http://schemas.microsoft.com/office/drawing/2010/main" val="0"/>
@@ -30170,7 +30190,7 @@
                                 <w:szCs w:val="24"/>
                               </w:rPr>
                             </w:pPr>
-                            <w:bookmarkStart w:id="114" w:name="_Toc159173568"/>
+                            <w:bookmarkStart w:id="114" w:name="_Toc159952222"/>
                             <w:r>
                               <w:rPr>
                                 <w:i w:val="0"/>
@@ -30283,7 +30303,7 @@
                           <w:szCs w:val="24"/>
                         </w:rPr>
                       </w:pPr>
-                      <w:bookmarkStart w:id="115" w:name="_Toc159173568"/>
+                      <w:bookmarkStart w:id="115" w:name="_Toc159952222"/>
                       <w:r>
                         <w:rPr>
                           <w:i w:val="0"/>
@@ -30400,7 +30420,7 @@
                     <pic:cNvPicPr/>
                   </pic:nvPicPr>
                   <pic:blipFill>
-                    <a:blip r:embed="rId37">
+                    <a:blip r:embed="rId36">
                       <a:extLst>
                         <a:ext uri="{28A0092B-C50C-407E-A947-70E740481C1C}">
                           <a14:useLocalDpi xmlns:a14="http://schemas.microsoft.com/office/drawing/2010/main" val="0"/>
@@ -31577,7 +31597,7 @@
                                 <w:szCs w:val="24"/>
                               </w:rPr>
                             </w:pPr>
-                            <w:bookmarkStart w:id="122" w:name="_Toc159173569"/>
+                            <w:bookmarkStart w:id="122" w:name="_Toc159952223"/>
                             <w:r>
                               <w:rPr>
                                 <w:i w:val="0"/>
@@ -31674,7 +31694,7 @@
                           <w:szCs w:val="24"/>
                         </w:rPr>
                       </w:pPr>
-                      <w:bookmarkStart w:id="123" w:name="_Toc159173569"/>
+                      <w:bookmarkStart w:id="123" w:name="_Toc159952223"/>
                       <w:r>
                         <w:rPr>
                           <w:i w:val="0"/>
@@ -31777,7 +31797,7 @@
                     <pic:cNvPicPr/>
                   </pic:nvPicPr>
                   <pic:blipFill>
-                    <a:blip r:embed="rId38">
+                    <a:blip r:embed="rId37">
                       <a:extLst>
                         <a:ext uri="{28A0092B-C50C-407E-A947-70E740481C1C}">
                           <a14:useLocalDpi xmlns:a14="http://schemas.microsoft.com/office/drawing/2010/main" val="0"/>
@@ -31908,7 +31928,7 @@
                                 <w:szCs w:val="24"/>
                               </w:rPr>
                             </w:pPr>
-                            <w:bookmarkStart w:id="124" w:name="_Toc159173570"/>
+                            <w:bookmarkStart w:id="124" w:name="_Toc159952224"/>
                             <w:r>
                               <w:rPr>
                                 <w:i w:val="0"/>
@@ -32005,7 +32025,7 @@
                           <w:szCs w:val="24"/>
                         </w:rPr>
                       </w:pPr>
-                      <w:bookmarkStart w:id="125" w:name="_Toc159173570"/>
+                      <w:bookmarkStart w:id="125" w:name="_Toc159952224"/>
                       <w:r>
                         <w:rPr>
                           <w:i w:val="0"/>
@@ -32108,7 +32128,7 @@
                     <pic:cNvPicPr/>
                   </pic:nvPicPr>
                   <pic:blipFill>
-                    <a:blip r:embed="rId39">
+                    <a:blip r:embed="rId38">
                       <a:extLst>
                         <a:ext uri="{28A0092B-C50C-407E-A947-70E740481C1C}">
                           <a14:useLocalDpi xmlns:a14="http://schemas.microsoft.com/office/drawing/2010/main" val="0"/>
@@ -32940,7 +32960,7 @@
                                 <w:szCs w:val="24"/>
                               </w:rPr>
                             </w:pPr>
-                            <w:bookmarkStart w:id="131" w:name="_Toc159173571"/>
+                            <w:bookmarkStart w:id="131" w:name="_Toc159952225"/>
                             <w:r>
                               <w:rPr>
                                 <w:i w:val="0"/>
@@ -33037,7 +33057,7 @@
                           <w:szCs w:val="24"/>
                         </w:rPr>
                       </w:pPr>
-                      <w:bookmarkStart w:id="132" w:name="_Toc159173571"/>
+                      <w:bookmarkStart w:id="132" w:name="_Toc159952225"/>
                       <w:r>
                         <w:rPr>
                           <w:i w:val="0"/>
@@ -33140,7 +33160,7 @@
                     <pic:cNvPicPr/>
                   </pic:nvPicPr>
                   <pic:blipFill>
-                    <a:blip r:embed="rId40" cstate="print">
+                    <a:blip r:embed="rId39" cstate="print">
                       <a:extLst>
                         <a:ext uri="{28A0092B-C50C-407E-A947-70E740481C1C}">
                           <a14:useLocalDpi xmlns:a14="http://schemas.microsoft.com/office/drawing/2010/main" val="0"/>
@@ -33224,7 +33244,7 @@
                                 <w:szCs w:val="24"/>
                               </w:rPr>
                             </w:pPr>
-                            <w:bookmarkStart w:id="133" w:name="_Toc159173572"/>
+                            <w:bookmarkStart w:id="133" w:name="_Toc159952226"/>
                             <w:r>
                               <w:rPr>
                                 <w:i w:val="0"/>
@@ -33321,7 +33341,7 @@
                           <w:szCs w:val="24"/>
                         </w:rPr>
                       </w:pPr>
-                      <w:bookmarkStart w:id="134" w:name="_Toc159173572"/>
+                      <w:bookmarkStart w:id="134" w:name="_Toc159952226"/>
                       <w:r>
                         <w:rPr>
                           <w:i w:val="0"/>
@@ -33401,7 +33421,7 @@
           <w:noProof/>
         </w:rPr>
         <w:drawing>
-          <wp:anchor distT="0" distB="0" distL="114300" distR="114300" simplePos="0" relativeHeight="251722752" behindDoc="0" locked="0" layoutInCell="1" allowOverlap="1" wp14:anchorId="18BAA9C4" wp14:editId="209DFAC5">
+          <wp:anchor distT="0" distB="0" distL="114300" distR="114300" simplePos="0" relativeHeight="251722752" behindDoc="0" locked="0" layoutInCell="1" allowOverlap="1" wp14:anchorId="18BAA9C4" wp14:editId="3689F048">
             <wp:simplePos x="0" y="0"/>
             <wp:positionH relativeFrom="page">
               <wp:posOffset>1348105</wp:posOffset>
@@ -33424,7 +33444,7 @@
                     <pic:cNvPicPr/>
                   </pic:nvPicPr>
                   <pic:blipFill>
-                    <a:blip r:embed="rId41" cstate="print">
+                    <a:blip r:embed="rId40" cstate="print">
                       <a:extLst>
                         <a:ext uri="{28A0092B-C50C-407E-A947-70E740481C1C}">
                           <a14:useLocalDpi xmlns:a14="http://schemas.microsoft.com/office/drawing/2010/main" val="0"/>
@@ -35247,7 +35267,7 @@
       <w:r>
         <w:t xml:space="preserve">]. Dostupné z: </w:t>
       </w:r>
-      <w:hyperlink r:id="rId42" w:history="1">
+      <w:hyperlink r:id="rId41" w:history="1">
         <w:r>
           <w:rPr>
             <w:rStyle w:val="Hypertextovodkaz"/>
@@ -35279,7 +35299,7 @@
       <w:r>
         <w:t xml:space="preserve"> [online]. [cit. 2024-02-11]. Dostupné z: </w:t>
       </w:r>
-      <w:hyperlink r:id="rId43" w:history="1">
+      <w:hyperlink r:id="rId42" w:history="1">
         <w:r>
           <w:rPr>
             <w:rStyle w:val="Hypertextovodkaz"/>
@@ -35394,7 +35414,7 @@
       <w:r>
         <w:fldChar w:fldCharType="separate"/>
       </w:r>
-      <w:hyperlink w:anchor="_Toc159173549" w:history="1">
+      <w:hyperlink w:anchor="_Toc159952203" w:history="1">
         <w:r>
           <w:rPr>
             <w:rStyle w:val="Hypertextovodkaz"/>
@@ -35421,7 +35441,7 @@
             <w:noProof/>
             <w:webHidden/>
           </w:rPr>
-          <w:instrText xml:space="preserve"> PAGEREF _Toc159173549 \h </w:instrText>
+          <w:instrText xml:space="preserve"> PAGEREF _Toc159952203 \h </w:instrText>
         </w:r>
         <w:r>
           <w:rPr>
@@ -35465,7 +35485,7 @@
           <w14:ligatures w14:val="standardContextual"/>
         </w:rPr>
       </w:pPr>
-      <w:hyperlink w:anchor="_Toc159173550" w:history="1">
+      <w:hyperlink w:anchor="_Toc159952204" w:history="1">
         <w:r>
           <w:rPr>
             <w:rStyle w:val="Hypertextovodkaz"/>
@@ -35492,7 +35512,7 @@
             <w:noProof/>
             <w:webHidden/>
           </w:rPr>
-          <w:instrText xml:space="preserve"> PAGEREF _Toc159173550 \h </w:instrText>
+          <w:instrText xml:space="preserve"> PAGEREF _Toc159952204 \h </w:instrText>
         </w:r>
         <w:r>
           <w:rPr>
@@ -35536,7 +35556,7 @@
           <w14:ligatures w14:val="standardContextual"/>
         </w:rPr>
       </w:pPr>
-      <w:hyperlink w:anchor="_Toc159173551" w:history="1">
+      <w:hyperlink w:anchor="_Toc159952205" w:history="1">
         <w:r>
           <w:rPr>
             <w:rStyle w:val="Hypertextovodkaz"/>
@@ -35563,7 +35583,7 @@
             <w:noProof/>
             <w:webHidden/>
           </w:rPr>
-          <w:instrText xml:space="preserve"> PAGEREF _Toc159173551 \h </w:instrText>
+          <w:instrText xml:space="preserve"> PAGEREF _Toc159952205 \h </w:instrText>
         </w:r>
         <w:r>
           <w:rPr>
@@ -35607,7 +35627,7 @@
           <w14:ligatures w14:val="standardContextual"/>
         </w:rPr>
       </w:pPr>
-      <w:hyperlink w:anchor="_Toc159173552" w:history="1">
+      <w:hyperlink w:anchor="_Toc159952206" w:history="1">
         <w:r>
           <w:rPr>
             <w:rStyle w:val="Hypertextovodkaz"/>
@@ -35634,7 +35654,7 @@
             <w:noProof/>
             <w:webHidden/>
           </w:rPr>
-          <w:instrText xml:space="preserve"> PAGEREF _Toc159173552 \h </w:instrText>
+          <w:instrText xml:space="preserve"> PAGEREF _Toc159952206 \h </w:instrText>
         </w:r>
         <w:r>
           <w:rPr>
@@ -35678,7 +35698,7 @@
           <w14:ligatures w14:val="standardContextual"/>
         </w:rPr>
       </w:pPr>
-      <w:hyperlink w:anchor="_Toc159173553" w:history="1">
+      <w:hyperlink w:anchor="_Toc159952207" w:history="1">
         <w:r>
           <w:rPr>
             <w:rStyle w:val="Hypertextovodkaz"/>
@@ -35705,7 +35725,7 @@
             <w:noProof/>
             <w:webHidden/>
           </w:rPr>
-          <w:instrText xml:space="preserve"> PAGEREF _Toc159173553 \h </w:instrText>
+          <w:instrText xml:space="preserve"> PAGEREF _Toc159952207 \h </w:instrText>
         </w:r>
         <w:r>
           <w:rPr>
@@ -35749,7 +35769,7 @@
           <w14:ligatures w14:val="standardContextual"/>
         </w:rPr>
       </w:pPr>
-      <w:hyperlink w:anchor="_Toc159173554" w:history="1">
+      <w:hyperlink w:anchor="_Toc159952208" w:history="1">
         <w:r>
           <w:rPr>
             <w:rStyle w:val="Hypertextovodkaz"/>
@@ -35776,7 +35796,7 @@
             <w:noProof/>
             <w:webHidden/>
           </w:rPr>
-          <w:instrText xml:space="preserve"> PAGEREF _Toc159173554 \h </w:instrText>
+          <w:instrText xml:space="preserve"> PAGEREF _Toc159952208 \h </w:instrText>
         </w:r>
         <w:r>
           <w:rPr>
@@ -35820,7 +35840,7 @@
           <w14:ligatures w14:val="standardContextual"/>
         </w:rPr>
       </w:pPr>
-      <w:hyperlink w:anchor="_Toc159173555" w:history="1">
+      <w:hyperlink w:anchor="_Toc159952209" w:history="1">
         <w:r>
           <w:rPr>
             <w:rStyle w:val="Hypertextovodkaz"/>
@@ -35847,7 +35867,7 @@
             <w:noProof/>
             <w:webHidden/>
           </w:rPr>
-          <w:instrText xml:space="preserve"> PAGEREF _Toc159173555 \h </w:instrText>
+          <w:instrText xml:space="preserve"> PAGEREF _Toc159952209 \h </w:instrText>
         </w:r>
         <w:r>
           <w:rPr>
@@ -35891,7 +35911,7 @@
           <w14:ligatures w14:val="standardContextual"/>
         </w:rPr>
       </w:pPr>
-      <w:hyperlink w:anchor="_Toc159173556" w:history="1">
+      <w:hyperlink w:anchor="_Toc159952210" w:history="1">
         <w:r>
           <w:rPr>
             <w:rStyle w:val="Hypertextovodkaz"/>
@@ -35918,7 +35938,7 @@
             <w:noProof/>
             <w:webHidden/>
           </w:rPr>
-          <w:instrText xml:space="preserve"> PAGEREF _Toc159173556 \h </w:instrText>
+          <w:instrText xml:space="preserve"> PAGEREF _Toc159952210 \h </w:instrText>
         </w:r>
         <w:r>
           <w:rPr>
@@ -35962,7 +35982,7 @@
           <w14:ligatures w14:val="standardContextual"/>
         </w:rPr>
       </w:pPr>
-      <w:hyperlink w:anchor="_Toc159173557" w:history="1">
+      <w:hyperlink w:anchor="_Toc159952211" w:history="1">
         <w:r>
           <w:rPr>
             <w:rStyle w:val="Hypertextovodkaz"/>
@@ -35989,7 +36009,7 @@
             <w:noProof/>
             <w:webHidden/>
           </w:rPr>
-          <w:instrText xml:space="preserve"> PAGEREF _Toc159173557 \h </w:instrText>
+          <w:instrText xml:space="preserve"> PAGEREF _Toc159952211 \h </w:instrText>
         </w:r>
         <w:r>
           <w:rPr>
@@ -36033,7 +36053,7 @@
           <w14:ligatures w14:val="standardContextual"/>
         </w:rPr>
       </w:pPr>
-      <w:hyperlink w:anchor="_Toc159173558" w:history="1">
+      <w:hyperlink w:anchor="_Toc159952212" w:history="1">
         <w:r>
           <w:rPr>
             <w:rStyle w:val="Hypertextovodkaz"/>
@@ -36060,7 +36080,7 @@
             <w:noProof/>
             <w:webHidden/>
           </w:rPr>
-          <w:instrText xml:space="preserve"> PAGEREF _Toc159173558 \h </w:instrText>
+          <w:instrText xml:space="preserve"> PAGEREF _Toc159952212 \h </w:instrText>
         </w:r>
         <w:r>
           <w:rPr>
@@ -36104,7 +36124,7 @@
           <w14:ligatures w14:val="standardContextual"/>
         </w:rPr>
       </w:pPr>
-      <w:hyperlink w:anchor="_Toc159173559" w:history="1">
+      <w:hyperlink w:anchor="_Toc159952213" w:history="1">
         <w:r>
           <w:rPr>
             <w:rStyle w:val="Hypertextovodkaz"/>
@@ -36131,7 +36151,7 @@
             <w:noProof/>
             <w:webHidden/>
           </w:rPr>
-          <w:instrText xml:space="preserve"> PAGEREF _Toc159173559 \h </w:instrText>
+          <w:instrText xml:space="preserve"> PAGEREF _Toc159952213 \h </w:instrText>
         </w:r>
         <w:r>
           <w:rPr>
@@ -36175,7 +36195,7 @@
           <w14:ligatures w14:val="standardContextual"/>
         </w:rPr>
       </w:pPr>
-      <w:hyperlink w:anchor="_Toc159173560" w:history="1">
+      <w:hyperlink w:anchor="_Toc159952214" w:history="1">
         <w:r>
           <w:rPr>
             <w:rStyle w:val="Hypertextovodkaz"/>
@@ -36202,7 +36222,7 @@
             <w:noProof/>
             <w:webHidden/>
           </w:rPr>
-          <w:instrText xml:space="preserve"> PAGEREF _Toc159173560 \h </w:instrText>
+          <w:instrText xml:space="preserve"> PAGEREF _Toc159952214 \h </w:instrText>
         </w:r>
         <w:r>
           <w:rPr>
@@ -36246,7 +36266,7 @@
           <w14:ligatures w14:val="standardContextual"/>
         </w:rPr>
       </w:pPr>
-      <w:hyperlink w:anchor="_Toc159173561" w:history="1">
+      <w:hyperlink w:anchor="_Toc159952215" w:history="1">
         <w:r>
           <w:rPr>
             <w:rStyle w:val="Hypertextovodkaz"/>
@@ -36273,7 +36293,7 @@
             <w:noProof/>
             <w:webHidden/>
           </w:rPr>
-          <w:instrText xml:space="preserve"> PAGEREF _Toc159173561 \h </w:instrText>
+          <w:instrText xml:space="preserve"> PAGEREF _Toc159952215 \h </w:instrText>
         </w:r>
         <w:r>
           <w:rPr>
@@ -36317,7 +36337,7 @@
           <w14:ligatures w14:val="standardContextual"/>
         </w:rPr>
       </w:pPr>
-      <w:hyperlink w:anchor="_Toc159173562" w:history="1">
+      <w:hyperlink w:anchor="_Toc159952216" w:history="1">
         <w:r>
           <w:rPr>
             <w:rStyle w:val="Hypertextovodkaz"/>
@@ -36344,7 +36364,7 @@
             <w:noProof/>
             <w:webHidden/>
           </w:rPr>
-          <w:instrText xml:space="preserve"> PAGEREF _Toc159173562 \h </w:instrText>
+          <w:instrText xml:space="preserve"> PAGEREF _Toc159952216 \h </w:instrText>
         </w:r>
         <w:r>
           <w:rPr>
@@ -36388,7 +36408,7 @@
           <w14:ligatures w14:val="standardContextual"/>
         </w:rPr>
       </w:pPr>
-      <w:hyperlink w:anchor="_Toc159173563" w:history="1">
+      <w:hyperlink w:anchor="_Toc159952217" w:history="1">
         <w:r>
           <w:rPr>
             <w:rStyle w:val="Hypertextovodkaz"/>
@@ -36430,7 +36450,7 @@
             <w:noProof/>
             <w:webHidden/>
           </w:rPr>
-          <w:instrText xml:space="preserve"> PAGEREF _Toc159173563 \h </w:instrText>
+          <w:instrText xml:space="preserve"> PAGEREF _Toc159952217 \h </w:instrText>
         </w:r>
         <w:r>
           <w:rPr>
@@ -36474,7 +36494,7 @@
           <w14:ligatures w14:val="standardContextual"/>
         </w:rPr>
       </w:pPr>
-      <w:hyperlink w:anchor="_Toc159173564" w:history="1">
+      <w:hyperlink w:anchor="_Toc159952218" w:history="1">
         <w:r>
           <w:rPr>
             <w:rStyle w:val="Hypertextovodkaz"/>
@@ -36501,7 +36521,7 @@
             <w:noProof/>
             <w:webHidden/>
           </w:rPr>
-          <w:instrText xml:space="preserve"> PAGEREF _Toc159173564 \h </w:instrText>
+          <w:instrText xml:space="preserve"> PAGEREF _Toc159952218 \h </w:instrText>
         </w:r>
         <w:r>
           <w:rPr>
@@ -36545,7 +36565,7 @@
           <w14:ligatures w14:val="standardContextual"/>
         </w:rPr>
       </w:pPr>
-      <w:hyperlink w:anchor="_Toc159173565" w:history="1">
+      <w:hyperlink w:anchor="_Toc159952219" w:history="1">
         <w:r>
           <w:rPr>
             <w:rStyle w:val="Hypertextovodkaz"/>
@@ -36572,7 +36592,7 @@
             <w:noProof/>
             <w:webHidden/>
           </w:rPr>
-          <w:instrText xml:space="preserve"> PAGEREF _Toc159173565 \h </w:instrText>
+          <w:instrText xml:space="preserve"> PAGEREF _Toc159952219 \h </w:instrText>
         </w:r>
         <w:r>
           <w:rPr>
@@ -36616,7 +36636,7 @@
           <w14:ligatures w14:val="standardContextual"/>
         </w:rPr>
       </w:pPr>
-      <w:hyperlink w:anchor="_Toc159173566" w:history="1">
+      <w:hyperlink w:anchor="_Toc159952220" w:history="1">
         <w:r>
           <w:rPr>
             <w:rStyle w:val="Hypertextovodkaz"/>
@@ -36643,7 +36663,7 @@
             <w:noProof/>
             <w:webHidden/>
           </w:rPr>
-          <w:instrText xml:space="preserve"> PAGEREF _Toc159173566 \h </w:instrText>
+          <w:instrText xml:space="preserve"> PAGEREF _Toc159952220 \h </w:instrText>
         </w:r>
         <w:r>
           <w:rPr>
@@ -36687,13 +36707,13 @@
           <w14:ligatures w14:val="standardContextual"/>
         </w:rPr>
       </w:pPr>
-      <w:hyperlink w:anchor="_Toc159173567" w:history="1">
+      <w:hyperlink w:anchor="_Toc159952221" w:history="1">
         <w:r>
           <w:rPr>
             <w:rStyle w:val="Hypertextovodkaz"/>
             <w:noProof/>
           </w:rPr>
-          <w:t>Obrázek 30 - UI ve hře (vlastní zpracování)</w:t>
+          <w:t>Obrázek 19 - UI ve hře (vlastní zpracování)</w:t>
         </w:r>
         <w:r>
           <w:rPr>
@@ -36714,7 +36734,7 @@
             <w:noProof/>
             <w:webHidden/>
           </w:rPr>
-          <w:instrText xml:space="preserve"> PAGEREF _Toc159173567 \h </w:instrText>
+          <w:instrText xml:space="preserve"> PAGEREF _Toc159952221 \h </w:instrText>
         </w:r>
         <w:r>
           <w:rPr>
@@ -36758,13 +36778,13 @@
           <w14:ligatures w14:val="standardContextual"/>
         </w:rPr>
       </w:pPr>
-      <w:hyperlink w:anchor="_Toc159173568" w:history="1">
+      <w:hyperlink w:anchor="_Toc159952222" w:history="1">
         <w:r>
           <w:rPr>
             <w:rStyle w:val="Hypertextovodkaz"/>
             <w:noProof/>
           </w:rPr>
-          <w:t>Obrázek 31 – EndMenu (vlastní zpracování)</w:t>
+          <w:t>Obrázek 20 – EndMenu (vlastní zpracování)</w:t>
         </w:r>
         <w:r>
           <w:rPr>
@@ -36785,7 +36805,7 @@
             <w:noProof/>
             <w:webHidden/>
           </w:rPr>
-          <w:instrText xml:space="preserve"> PAGEREF _Toc159173568 \h </w:instrText>
+          <w:instrText xml:space="preserve"> PAGEREF _Toc159952222 \h </w:instrText>
         </w:r>
         <w:r>
           <w:rPr>
@@ -36829,13 +36849,13 @@
           <w14:ligatures w14:val="standardContextual"/>
         </w:rPr>
       </w:pPr>
-      <w:hyperlink w:anchor="_Toc159173569" w:history="1">
+      <w:hyperlink w:anchor="_Toc159952223" w:history="1">
         <w:r>
           <w:rPr>
             <w:rStyle w:val="Hypertextovodkaz"/>
             <w:noProof/>
           </w:rPr>
-          <w:t>Obrázek 32 - Nastavení projektu, seznam kategorií (vlastní zpracování)</w:t>
+          <w:t>Obrázek 21 - Nastavení projektu, seznam kategorií (vlastní zpracování)</w:t>
         </w:r>
         <w:r>
           <w:rPr>
@@ -36856,7 +36876,7 @@
             <w:noProof/>
             <w:webHidden/>
           </w:rPr>
-          <w:instrText xml:space="preserve"> PAGEREF _Toc159173569 \h </w:instrText>
+          <w:instrText xml:space="preserve"> PAGEREF _Toc159952223 \h </w:instrText>
         </w:r>
         <w:r>
           <w:rPr>
@@ -36900,13 +36920,13 @@
           <w14:ligatures w14:val="standardContextual"/>
         </w:rPr>
       </w:pPr>
-      <w:hyperlink w:anchor="_Toc159173570" w:history="1">
+      <w:hyperlink w:anchor="_Toc159952224" w:history="1">
         <w:r>
           <w:rPr>
             <w:rStyle w:val="Hypertextovodkaz"/>
             <w:noProof/>
           </w:rPr>
-          <w:t>Obrázek 33 - příklad nastavení Identification (vlastní zpracování)</w:t>
+          <w:t>Obrázek 22 - příklad nastavení Identification (vlastní zpracování)</w:t>
         </w:r>
         <w:r>
           <w:rPr>
@@ -36927,7 +36947,7 @@
             <w:noProof/>
             <w:webHidden/>
           </w:rPr>
-          <w:instrText xml:space="preserve"> PAGEREF _Toc159173570 \h </w:instrText>
+          <w:instrText xml:space="preserve"> PAGEREF _Toc159952224 \h </w:instrText>
         </w:r>
         <w:r>
           <w:rPr>
@@ -36971,13 +36991,13 @@
           <w14:ligatures w14:val="standardContextual"/>
         </w:rPr>
       </w:pPr>
-      <w:hyperlink w:anchor="_Toc159173571" w:history="1">
+      <w:hyperlink w:anchor="_Toc159952225" w:history="1">
         <w:r>
           <w:rPr>
             <w:rStyle w:val="Hypertextovodkaz"/>
             <w:noProof/>
           </w:rPr>
-          <w:t>Obrázek 35 - pozvánka k testování 2 (vlastní zpracování)</w:t>
+          <w:t>Obrázek 23 - pozvánka k testování 2 (vlastní zpracování)</w:t>
         </w:r>
         <w:r>
           <w:rPr>
@@ -36998,7 +37018,7 @@
             <w:noProof/>
             <w:webHidden/>
           </w:rPr>
-          <w:instrText xml:space="preserve"> PAGEREF _Toc159173571 \h </w:instrText>
+          <w:instrText xml:space="preserve"> PAGEREF _Toc159952225 \h </w:instrText>
         </w:r>
         <w:r>
           <w:rPr>
@@ -37042,13 +37062,13 @@
           <w14:ligatures w14:val="standardContextual"/>
         </w:rPr>
       </w:pPr>
-      <w:hyperlink w:anchor="_Toc159173572" w:history="1">
+      <w:hyperlink w:anchor="_Toc159952226" w:history="1">
         <w:r>
           <w:rPr>
             <w:rStyle w:val="Hypertextovodkaz"/>
             <w:noProof/>
           </w:rPr>
-          <w:t>Obrázek 34 - pozvánka k testovaní 1 (vlastní zpracování)</w:t>
+          <w:t>Obrázek 24 - pozvánka k testovaní 1 (vlastní zpracování)</w:t>
         </w:r>
         <w:r>
           <w:rPr>
@@ -37069,7 +37089,7 @@
             <w:noProof/>
             <w:webHidden/>
           </w:rPr>
-          <w:instrText xml:space="preserve"> PAGEREF _Toc159173572 \h </w:instrText>
+          <w:instrText xml:space="preserve"> PAGEREF _Toc159952226 \h </w:instrText>
         </w:r>
         <w:r>
           <w:rPr>
@@ -37113,13 +37133,13 @@
           <w14:ligatures w14:val="standardContextual"/>
         </w:rPr>
       </w:pPr>
-      <w:hyperlink w:anchor="_Toc159173573" w:history="1">
+      <w:hyperlink w:anchor="_Toc159952227" w:history="1">
         <w:r>
           <w:rPr>
             <w:rStyle w:val="Hypertextovodkaz"/>
             <w:noProof/>
           </w:rPr>
-          <w:t>Obrázek 19 – FrostBall (vlastní zpracování)</w:t>
+          <w:t>Obrázek 25 – FrostBall (vlastní zpracování)</w:t>
         </w:r>
         <w:r>
           <w:rPr>
@@ -37140,7 +37160,7 @@
             <w:noProof/>
             <w:webHidden/>
           </w:rPr>
-          <w:instrText xml:space="preserve"> PAGEREF _Toc159173573 \h </w:instrText>
+          <w:instrText xml:space="preserve"> PAGEREF _Toc159952227 \h </w:instrText>
         </w:r>
         <w:r>
           <w:rPr>
@@ -37160,7 +37180,7 @@
             <w:noProof/>
             <w:webHidden/>
           </w:rPr>
-          <w:t>II</w:t>
+          <w:t>46</w:t>
         </w:r>
         <w:r>
           <w:rPr>
@@ -37184,13 +37204,13 @@
           <w14:ligatures w14:val="standardContextual"/>
         </w:rPr>
       </w:pPr>
-      <w:hyperlink w:anchor="_Toc159173574" w:history="1">
+      <w:hyperlink w:anchor="_Toc159952228" w:history="1">
         <w:r>
           <w:rPr>
             <w:rStyle w:val="Hypertextovodkaz"/>
             <w:noProof/>
           </w:rPr>
-          <w:t>Obrázek 20 – FireBall (vlastní zpracování)</w:t>
+          <w:t>Obrázek 26 – FireBall (vlastní zpracování)</w:t>
         </w:r>
         <w:r>
           <w:rPr>
@@ -37211,7 +37231,7 @@
             <w:noProof/>
             <w:webHidden/>
           </w:rPr>
-          <w:instrText xml:space="preserve"> PAGEREF _Toc159173574 \h </w:instrText>
+          <w:instrText xml:space="preserve"> PAGEREF _Toc159952228 \h </w:instrText>
         </w:r>
         <w:r>
           <w:rPr>
@@ -37231,7 +37251,7 @@
             <w:noProof/>
             <w:webHidden/>
           </w:rPr>
-          <w:t>II</w:t>
+          <w:t>46</w:t>
         </w:r>
         <w:r>
           <w:rPr>
@@ -37255,13 +37275,13 @@
           <w14:ligatures w14:val="standardContextual"/>
         </w:rPr>
       </w:pPr>
-      <w:hyperlink w:anchor="_Toc159173575" w:history="1">
+      <w:hyperlink w:anchor="_Toc159952229" w:history="1">
         <w:r>
           <w:rPr>
             <w:rStyle w:val="Hypertextovodkaz"/>
             <w:noProof/>
           </w:rPr>
-          <w:t>Obrázek 21 – FrostNova (vlastní zpracování)</w:t>
+          <w:t>Obrázek 27 – FrostNova (vlastní zpracování)</w:t>
         </w:r>
         <w:r>
           <w:rPr>
@@ -37282,7 +37302,7 @@
             <w:noProof/>
             <w:webHidden/>
           </w:rPr>
-          <w:instrText xml:space="preserve"> PAGEREF _Toc159173575 \h </w:instrText>
+          <w:instrText xml:space="preserve"> PAGEREF _Toc159952229 \h </w:instrText>
         </w:r>
         <w:r>
           <w:rPr>
@@ -37302,7 +37322,7 @@
             <w:noProof/>
             <w:webHidden/>
           </w:rPr>
-          <w:t>II</w:t>
+          <w:t>46</w:t>
         </w:r>
         <w:r>
           <w:rPr>
@@ -37326,13 +37346,13 @@
           <w14:ligatures w14:val="standardContextual"/>
         </w:rPr>
       </w:pPr>
-      <w:hyperlink w:anchor="_Toc159173576" w:history="1">
+      <w:hyperlink w:anchor="_Toc159952230" w:history="1">
         <w:r>
           <w:rPr>
             <w:rStyle w:val="Hypertextovodkaz"/>
             <w:noProof/>
           </w:rPr>
-          <w:t>Obrázek 22 – ChainLightning (vlastní zpracování)</w:t>
+          <w:t>Obrázek 28 – ChainLightning (vlastní zpracování)</w:t>
         </w:r>
         <w:r>
           <w:rPr>
@@ -37353,7 +37373,7 @@
             <w:noProof/>
             <w:webHidden/>
           </w:rPr>
-          <w:instrText xml:space="preserve"> PAGEREF _Toc159173576 \h </w:instrText>
+          <w:instrText xml:space="preserve"> PAGEREF _Toc159952230 \h </w:instrText>
         </w:r>
         <w:r>
           <w:rPr>
@@ -37373,7 +37393,7 @@
             <w:noProof/>
             <w:webHidden/>
           </w:rPr>
-          <w:t>III</w:t>
+          <w:t>47</w:t>
         </w:r>
         <w:r>
           <w:rPr>
@@ -37397,13 +37417,13 @@
           <w14:ligatures w14:val="standardContextual"/>
         </w:rPr>
       </w:pPr>
-      <w:hyperlink w:anchor="_Toc159173577" w:history="1">
+      <w:hyperlink w:anchor="_Toc159952231" w:history="1">
         <w:r>
           <w:rPr>
             <w:rStyle w:val="Hypertextovodkaz"/>
             <w:noProof/>
           </w:rPr>
-          <w:t>Obrázek 25 – PyroBlast (vlastní zpracování)</w:t>
+          <w:t>Obrázek 29 – PyroBlast (vlastní zpracování)</w:t>
         </w:r>
         <w:r>
           <w:rPr>
@@ -37424,7 +37444,7 @@
             <w:noProof/>
             <w:webHidden/>
           </w:rPr>
-          <w:instrText xml:space="preserve"> PAGEREF _Toc159173577 \h </w:instrText>
+          <w:instrText xml:space="preserve"> PAGEREF _Toc159952231 \h </w:instrText>
         </w:r>
         <w:r>
           <w:rPr>
@@ -37444,7 +37464,7 @@
             <w:noProof/>
             <w:webHidden/>
           </w:rPr>
-          <w:t>III</w:t>
+          <w:t>47</w:t>
         </w:r>
         <w:r>
           <w:rPr>
@@ -37468,13 +37488,13 @@
           <w14:ligatures w14:val="standardContextual"/>
         </w:rPr>
       </w:pPr>
-      <w:hyperlink w:anchor="_Toc159173578" w:history="1">
+      <w:hyperlink w:anchor="_Toc159952232" w:history="1">
         <w:r>
           <w:rPr>
             <w:rStyle w:val="Hypertextovodkaz"/>
             <w:noProof/>
           </w:rPr>
-          <w:t>Obrázek 23 – WindBlast (vlastní zpracování)</w:t>
+          <w:t>Obrázek 30 – WindBlast (vlastní zpracování)</w:t>
         </w:r>
         <w:r>
           <w:rPr>
@@ -37495,7 +37515,7 @@
             <w:noProof/>
             <w:webHidden/>
           </w:rPr>
-          <w:instrText xml:space="preserve"> PAGEREF _Toc159173578 \h </w:instrText>
+          <w:instrText xml:space="preserve"> PAGEREF _Toc159952232 \h </w:instrText>
         </w:r>
         <w:r>
           <w:rPr>
@@ -37515,7 +37535,7 @@
             <w:noProof/>
             <w:webHidden/>
           </w:rPr>
-          <w:t>III</w:t>
+          <w:t>47</w:t>
         </w:r>
         <w:r>
           <w:rPr>
@@ -37539,13 +37559,13 @@
           <w14:ligatures w14:val="standardContextual"/>
         </w:rPr>
       </w:pPr>
-      <w:hyperlink w:anchor="_Toc159173579" w:history="1">
+      <w:hyperlink w:anchor="_Toc159952233" w:history="1">
         <w:r>
           <w:rPr>
             <w:rStyle w:val="Hypertextovodkaz"/>
             <w:noProof/>
           </w:rPr>
-          <w:t>Obrázek 24 – LightningBolt (vlastní zpracování)</w:t>
+          <w:t>Obrázek 31 – LightningBolt (vlastní zpracování)</w:t>
         </w:r>
         <w:r>
           <w:rPr>
@@ -37566,7 +37586,7 @@
             <w:noProof/>
             <w:webHidden/>
           </w:rPr>
-          <w:instrText xml:space="preserve"> PAGEREF _Toc159173579 \h </w:instrText>
+          <w:instrText xml:space="preserve"> PAGEREF _Toc159952233 \h </w:instrText>
         </w:r>
         <w:r>
           <w:rPr>
@@ -37586,7 +37606,7 @@
             <w:noProof/>
             <w:webHidden/>
           </w:rPr>
-          <w:t>III</w:t>
+          <w:t>47</w:t>
         </w:r>
         <w:r>
           <w:rPr>
@@ -37610,13 +37630,13 @@
           <w14:ligatures w14:val="standardContextual"/>
         </w:rPr>
       </w:pPr>
-      <w:hyperlink w:anchor="_Toc159173580" w:history="1">
+      <w:hyperlink w:anchor="_Toc159952234" w:history="1">
         <w:r>
           <w:rPr>
             <w:rStyle w:val="Hypertextovodkaz"/>
             <w:noProof/>
           </w:rPr>
-          <w:t>Obrázek 26 – Tornado (vlastní zpracování)</w:t>
+          <w:t>Obrázek 32 – Tornado (vlastní zpracování)</w:t>
         </w:r>
         <w:r>
           <w:rPr>
@@ -37637,7 +37657,7 @@
             <w:noProof/>
             <w:webHidden/>
           </w:rPr>
-          <w:instrText xml:space="preserve"> PAGEREF _Toc159173580 \h </w:instrText>
+          <w:instrText xml:space="preserve"> PAGEREF _Toc159952234 \h </w:instrText>
         </w:r>
         <w:r>
           <w:rPr>
@@ -37657,7 +37677,7 @@
             <w:noProof/>
             <w:webHidden/>
           </w:rPr>
-          <w:t>IV</w:t>
+          <w:t>48</w:t>
         </w:r>
         <w:r>
           <w:rPr>
@@ -37681,13 +37701,13 @@
           <w14:ligatures w14:val="standardContextual"/>
         </w:rPr>
       </w:pPr>
-      <w:hyperlink w:anchor="_Toc159173581" w:history="1">
+      <w:hyperlink w:anchor="_Toc159952235" w:history="1">
         <w:r>
           <w:rPr>
             <w:rStyle w:val="Hypertextovodkaz"/>
             <w:noProof/>
           </w:rPr>
-          <w:t>Obrázek 27 – FrostRing (vlastní zpracování)</w:t>
+          <w:t>Obrázek 33 – FrostRing (vlastní zpracování)</w:t>
         </w:r>
         <w:r>
           <w:rPr>
@@ -37708,7 +37728,7 @@
             <w:noProof/>
             <w:webHidden/>
           </w:rPr>
-          <w:instrText xml:space="preserve"> PAGEREF _Toc159173581 \h </w:instrText>
+          <w:instrText xml:space="preserve"> PAGEREF _Toc159952235 \h </w:instrText>
         </w:r>
         <w:r>
           <w:rPr>
@@ -37728,7 +37748,7 @@
             <w:noProof/>
             <w:webHidden/>
           </w:rPr>
-          <w:t>IV</w:t>
+          <w:t>48</w:t>
         </w:r>
         <w:r>
           <w:rPr>
@@ -37752,13 +37772,13 @@
           <w14:ligatures w14:val="standardContextual"/>
         </w:rPr>
       </w:pPr>
-      <w:hyperlink w:anchor="_Toc159173582" w:history="1">
+      <w:hyperlink w:anchor="_Toc159952236" w:history="1">
         <w:r>
           <w:rPr>
             <w:rStyle w:val="Hypertextovodkaz"/>
             <w:noProof/>
           </w:rPr>
-          <w:t>Obrázek 28 – FrostOrb (vlastní zpracování)</w:t>
+          <w:t>Obrázek 34 – FrostOrb (vlastní zpracování)</w:t>
         </w:r>
         <w:r>
           <w:rPr>
@@ -37779,7 +37799,7 @@
             <w:noProof/>
             <w:webHidden/>
           </w:rPr>
-          <w:instrText xml:space="preserve"> PAGEREF _Toc159173582 \h </w:instrText>
+          <w:instrText xml:space="preserve"> PAGEREF _Toc159952236 \h </w:instrText>
         </w:r>
         <w:r>
           <w:rPr>
@@ -37799,7 +37819,7 @@
             <w:noProof/>
             <w:webHidden/>
           </w:rPr>
-          <w:t>IV</w:t>
+          <w:t>48</w:t>
         </w:r>
         <w:r>
           <w:rPr>
@@ -37823,13 +37843,13 @@
           <w14:ligatures w14:val="standardContextual"/>
         </w:rPr>
       </w:pPr>
-      <w:hyperlink w:anchor="_Toc159173583" w:history="1">
+      <w:hyperlink w:anchor="_Toc159952237" w:history="1">
         <w:r>
           <w:rPr>
             <w:rStyle w:val="Hypertextovodkaz"/>
             <w:noProof/>
           </w:rPr>
-          <w:t>Obrázek 29 – LightningOrb (vlastní zpracování)</w:t>
+          <w:t>Obrázek 35 – LightningOrb (vlastní zpracování)</w:t>
         </w:r>
         <w:r>
           <w:rPr>
@@ -37850,7 +37870,7 @@
             <w:noProof/>
             <w:webHidden/>
           </w:rPr>
-          <w:instrText xml:space="preserve"> PAGEREF _Toc159173583 \h </w:instrText>
+          <w:instrText xml:space="preserve"> PAGEREF _Toc159952237 \h </w:instrText>
         </w:r>
         <w:r>
           <w:rPr>
@@ -37870,7 +37890,7 @@
             <w:noProof/>
             <w:webHidden/>
           </w:rPr>
-          <w:t>IV</w:t>
+          <w:t>48</w:t>
         </w:r>
         <w:r>
           <w:rPr>
@@ -37923,7 +37943,7 @@
       <w:r>
         <w:fldChar w:fldCharType="separate"/>
       </w:r>
-      <w:hyperlink w:anchor="_Toc159173592" w:history="1">
+      <w:hyperlink w:anchor="_Toc159952194" w:history="1">
         <w:r>
           <w:rPr>
             <w:rStyle w:val="Hypertextovodkaz"/>
@@ -37950,7 +37970,7 @@
             <w:noProof/>
             <w:webHidden/>
           </w:rPr>
-          <w:instrText xml:space="preserve"> PAGEREF _Toc159173592 \h </w:instrText>
+          <w:instrText xml:space="preserve"> PAGEREF _Toc159952194 \h </w:instrText>
         </w:r>
         <w:r>
           <w:rPr>
@@ -37994,7 +38014,7 @@
           <w14:ligatures w14:val="standardContextual"/>
         </w:rPr>
       </w:pPr>
-      <w:hyperlink w:anchor="_Toc159173593" w:history="1">
+      <w:hyperlink w:anchor="_Toc159952195" w:history="1">
         <w:r>
           <w:rPr>
             <w:rStyle w:val="Hypertextovodkaz"/>
@@ -38021,7 +38041,7 @@
             <w:noProof/>
             <w:webHidden/>
           </w:rPr>
-          <w:instrText xml:space="preserve"> PAGEREF _Toc159173593 \h </w:instrText>
+          <w:instrText xml:space="preserve"> PAGEREF _Toc159952195 \h </w:instrText>
         </w:r>
         <w:r>
           <w:rPr>
@@ -38065,7 +38085,7 @@
           <w14:ligatures w14:val="standardContextual"/>
         </w:rPr>
       </w:pPr>
-      <w:hyperlink w:anchor="_Toc159173594" w:history="1">
+      <w:hyperlink w:anchor="_Toc159952196" w:history="1">
         <w:r>
           <w:rPr>
             <w:rStyle w:val="Hypertextovodkaz"/>
@@ -38092,7 +38112,7 @@
             <w:noProof/>
             <w:webHidden/>
           </w:rPr>
-          <w:instrText xml:space="preserve"> PAGEREF _Toc159173594 \h </w:instrText>
+          <w:instrText xml:space="preserve"> PAGEREF _Toc159952196 \h </w:instrText>
         </w:r>
         <w:r>
           <w:rPr>
@@ -38112,7 +38132,7 @@
             <w:noProof/>
             <w:webHidden/>
           </w:rPr>
-          <w:t>II</w:t>
+          <w:t>46</w:t>
         </w:r>
         <w:r>
           <w:rPr>
@@ -38136,7 +38156,7 @@
           <w14:ligatures w14:val="standardContextual"/>
         </w:rPr>
       </w:pPr>
-      <w:hyperlink w:anchor="_Toc159173595" w:history="1">
+      <w:hyperlink w:anchor="_Toc159952197" w:history="1">
         <w:r>
           <w:rPr>
             <w:rStyle w:val="Hypertextovodkaz"/>
@@ -38163,7 +38183,7 @@
             <w:noProof/>
             <w:webHidden/>
           </w:rPr>
-          <w:instrText xml:space="preserve"> PAGEREF _Toc159173595 \h </w:instrText>
+          <w:instrText xml:space="preserve"> PAGEREF _Toc159952197 \h </w:instrText>
         </w:r>
         <w:r>
           <w:rPr>
@@ -38183,7 +38203,7 @@
             <w:noProof/>
             <w:webHidden/>
           </w:rPr>
-          <w:t>II</w:t>
+          <w:t>46</w:t>
         </w:r>
         <w:r>
           <w:rPr>
@@ -38207,7 +38227,7 @@
           <w14:ligatures w14:val="standardContextual"/>
         </w:rPr>
       </w:pPr>
-      <w:hyperlink w:anchor="_Toc159173596" w:history="1">
+      <w:hyperlink w:anchor="_Toc159952198" w:history="1">
         <w:r>
           <w:rPr>
             <w:rStyle w:val="Hypertextovodkaz"/>
@@ -38234,7 +38254,7 @@
             <w:noProof/>
             <w:webHidden/>
           </w:rPr>
-          <w:instrText xml:space="preserve"> PAGEREF _Toc159173596 \h </w:instrText>
+          <w:instrText xml:space="preserve"> PAGEREF _Toc159952198 \h </w:instrText>
         </w:r>
         <w:r>
           <w:rPr>
@@ -38254,7 +38274,7 @@
             <w:noProof/>
             <w:webHidden/>
           </w:rPr>
-          <w:t>III</w:t>
+          <w:t>47</w:t>
         </w:r>
         <w:r>
           <w:rPr>
@@ -38278,7 +38298,7 @@
           <w14:ligatures w14:val="standardContextual"/>
         </w:rPr>
       </w:pPr>
-      <w:hyperlink w:anchor="_Toc159173597" w:history="1">
+      <w:hyperlink w:anchor="_Toc159952199" w:history="1">
         <w:r>
           <w:rPr>
             <w:rStyle w:val="Hypertextovodkaz"/>
@@ -38305,7 +38325,7 @@
             <w:noProof/>
             <w:webHidden/>
           </w:rPr>
-          <w:instrText xml:space="preserve"> PAGEREF _Toc159173597 \h </w:instrText>
+          <w:instrText xml:space="preserve"> PAGEREF _Toc159952199 \h </w:instrText>
         </w:r>
         <w:r>
           <w:rPr>
@@ -38325,7 +38345,7 @@
             <w:noProof/>
             <w:webHidden/>
           </w:rPr>
-          <w:t>III</w:t>
+          <w:t>47</w:t>
         </w:r>
         <w:r>
           <w:rPr>
@@ -38349,7 +38369,7 @@
           <w14:ligatures w14:val="standardContextual"/>
         </w:rPr>
       </w:pPr>
-      <w:hyperlink w:anchor="_Toc159173598" w:history="1">
+      <w:hyperlink w:anchor="_Toc159952200" w:history="1">
         <w:r>
           <w:rPr>
             <w:rStyle w:val="Hypertextovodkaz"/>
@@ -38376,7 +38396,7 @@
             <w:noProof/>
             <w:webHidden/>
           </w:rPr>
-          <w:instrText xml:space="preserve"> PAGEREF _Toc159173598 \h </w:instrText>
+          <w:instrText xml:space="preserve"> PAGEREF _Toc159952200 \h </w:instrText>
         </w:r>
         <w:r>
           <w:rPr>
@@ -38396,7 +38416,7 @@
             <w:noProof/>
             <w:webHidden/>
           </w:rPr>
-          <w:t>IV</w:t>
+          <w:t>48</w:t>
         </w:r>
         <w:r>
           <w:rPr>
@@ -38420,7 +38440,7 @@
           <w14:ligatures w14:val="standardContextual"/>
         </w:rPr>
       </w:pPr>
-      <w:hyperlink w:anchor="_Toc159173599" w:history="1">
+      <w:hyperlink w:anchor="_Toc159952201" w:history="1">
         <w:r>
           <w:rPr>
             <w:rStyle w:val="Hypertextovodkaz"/>
@@ -38447,7 +38467,7 @@
             <w:noProof/>
             <w:webHidden/>
           </w:rPr>
-          <w:instrText xml:space="preserve"> PAGEREF _Toc159173599 \h </w:instrText>
+          <w:instrText xml:space="preserve"> PAGEREF _Toc159952201 \h </w:instrText>
         </w:r>
         <w:r>
           <w:rPr>
@@ -38467,7 +38487,7 @@
             <w:noProof/>
             <w:webHidden/>
           </w:rPr>
-          <w:t>IV</w:t>
+          <w:t>48</w:t>
         </w:r>
         <w:r>
           <w:rPr>
@@ -38534,7 +38554,7 @@
           <w:numId w:val="0"/>
         </w:numPr>
         <w:sectPr>
-          <w:footerReference w:type="default" r:id="rId44"/>
+          <w:footerReference w:type="default" r:id="rId43"/>
           <w:pgSz w:w="11907" w:h="16839" w:code="9"/>
           <w:pgMar w:top="1701" w:right="1134" w:bottom="1418" w:left="1985" w:header="709" w:footer="709" w:gutter="0"/>
           <w:pgNumType w:start="1"/>
@@ -39473,7 +39493,7 @@
           <w:szCs w:val="20"/>
         </w:rPr>
       </w:pPr>
-      <w:bookmarkStart w:id="171" w:name="_Toc159173594"/>
+      <w:bookmarkStart w:id="171" w:name="_Toc159952196"/>
       <w:r>
         <w:rPr>
           <w:i w:val="0"/>
@@ -39606,7 +39626,7 @@
                                 <w:szCs w:val="24"/>
                               </w:rPr>
                             </w:pPr>
-                            <w:bookmarkStart w:id="172" w:name="_Toc159173573"/>
+                            <w:bookmarkStart w:id="172" w:name="_Toc159952227"/>
                             <w:r>
                               <w:rPr>
                                 <w:i w:val="0"/>
@@ -39717,7 +39737,7 @@
                           <w:szCs w:val="24"/>
                         </w:rPr>
                       </w:pPr>
-                      <w:bookmarkStart w:id="173" w:name="_Toc159173573"/>
+                      <w:bookmarkStart w:id="173" w:name="_Toc159952227"/>
                       <w:r>
                         <w:rPr>
                           <w:i w:val="0"/>
@@ -39858,7 +39878,7 @@
                                 <w:szCs w:val="24"/>
                               </w:rPr>
                             </w:pPr>
-                            <w:bookmarkStart w:id="174" w:name="_Toc159173574"/>
+                            <w:bookmarkStart w:id="174" w:name="_Toc159952228"/>
                             <w:r>
                               <w:rPr>
                                 <w:i w:val="0"/>
@@ -39969,7 +39989,7 @@
                           <w:szCs w:val="24"/>
                         </w:rPr>
                       </w:pPr>
-                      <w:bookmarkStart w:id="175" w:name="_Toc159173574"/>
+                      <w:bookmarkStart w:id="175" w:name="_Toc159952228"/>
                       <w:r>
                         <w:rPr>
                           <w:i w:val="0"/>
@@ -40086,7 +40106,7 @@
                     <pic:cNvPicPr/>
                   </pic:nvPicPr>
                   <pic:blipFill>
-                    <a:blip r:embed="rId45">
+                    <a:blip r:embed="rId44">
                       <a:extLst>
                         <a:ext uri="{28A0092B-C50C-407E-A947-70E740481C1C}">
                           <a14:useLocalDpi xmlns:a14="http://schemas.microsoft.com/office/drawing/2010/main" val="0"/>
@@ -40146,7 +40166,7 @@
                     <pic:cNvPicPr/>
                   </pic:nvPicPr>
                   <pic:blipFill>
-                    <a:blip r:embed="rId46">
+                    <a:blip r:embed="rId45">
                       <a:extLst>
                         <a:ext uri="{28A0092B-C50C-407E-A947-70E740481C1C}">
                           <a14:useLocalDpi xmlns:a14="http://schemas.microsoft.com/office/drawing/2010/main" val="0"/>
@@ -40895,7 +40915,7 @@
           <w:szCs w:val="20"/>
         </w:rPr>
       </w:pPr>
-      <w:bookmarkStart w:id="176" w:name="_Toc159173595"/>
+      <w:bookmarkStart w:id="176" w:name="_Toc159952197"/>
       <w:r>
         <w:rPr>
           <w:i w:val="0"/>
@@ -41037,7 +41057,7 @@
                                 <w:szCs w:val="24"/>
                               </w:rPr>
                             </w:pPr>
-                            <w:bookmarkStart w:id="177" w:name="_Toc159173575"/>
+                            <w:bookmarkStart w:id="177" w:name="_Toc159952229"/>
                             <w:r>
                               <w:rPr>
                                 <w:i w:val="0"/>
@@ -41148,7 +41168,7 @@
                           <w:szCs w:val="24"/>
                         </w:rPr>
                       </w:pPr>
-                      <w:bookmarkStart w:id="178" w:name="_Toc159173575"/>
+                      <w:bookmarkStart w:id="178" w:name="_Toc159952229"/>
                       <w:r>
                         <w:rPr>
                           <w:i w:val="0"/>
@@ -41265,7 +41285,7 @@
                     <pic:cNvPicPr/>
                   </pic:nvPicPr>
                   <pic:blipFill>
-                    <a:blip r:embed="rId47">
+                    <a:blip r:embed="rId46">
                       <a:extLst>
                         <a:ext uri="{28A0092B-C50C-407E-A947-70E740481C1C}">
                           <a14:useLocalDpi xmlns:a14="http://schemas.microsoft.com/office/drawing/2010/main" val="0"/>
@@ -42005,7 +42025,7 @@
           <w:szCs w:val="20"/>
         </w:rPr>
       </w:pPr>
-      <w:bookmarkStart w:id="179" w:name="_Toc159173596"/>
+      <w:bookmarkStart w:id="179" w:name="_Toc159952198"/>
       <w:r>
         <w:rPr>
           <w:i w:val="0"/>
@@ -42138,7 +42158,7 @@
                                 <w:szCs w:val="24"/>
                               </w:rPr>
                             </w:pPr>
-                            <w:bookmarkStart w:id="180" w:name="_Toc159173576"/>
+                            <w:bookmarkStart w:id="180" w:name="_Toc159952230"/>
                             <w:r>
                               <w:rPr>
                                 <w:i w:val="0"/>
@@ -42249,7 +42269,7 @@
                           <w:szCs w:val="24"/>
                         </w:rPr>
                       </w:pPr>
-                      <w:bookmarkStart w:id="181" w:name="_Toc159173576"/>
+                      <w:bookmarkStart w:id="181" w:name="_Toc159952230"/>
                       <w:r>
                         <w:rPr>
                           <w:i w:val="0"/>
@@ -42366,7 +42386,7 @@
                     <pic:cNvPicPr/>
                   </pic:nvPicPr>
                   <pic:blipFill>
-                    <a:blip r:embed="rId48">
+                    <a:blip r:embed="rId47">
                       <a:extLst>
                         <a:ext uri="{28A0092B-C50C-407E-A947-70E740481C1C}">
                           <a14:useLocalDpi xmlns:a14="http://schemas.microsoft.com/office/drawing/2010/main" val="0"/>
@@ -44141,7 +44161,7 @@
           <w:szCs w:val="20"/>
         </w:rPr>
       </w:pPr>
-      <w:bookmarkStart w:id="182" w:name="_Toc159173597"/>
+      <w:bookmarkStart w:id="182" w:name="_Toc159952199"/>
       <w:r>
         <w:rPr>
           <w:i w:val="0"/>
@@ -44220,7 +44240,7 @@
         <mc:AlternateContent>
           <mc:Choice Requires="wps">
             <w:drawing>
-              <wp:anchor distT="0" distB="0" distL="114300" distR="114300" simplePos="0" relativeHeight="251786240" behindDoc="0" locked="0" layoutInCell="1" allowOverlap="1" wp14:anchorId="7AC7A249" wp14:editId="356F07FA">
+              <wp:anchor distT="0" distB="0" distL="114300" distR="114300" simplePos="0" relativeHeight="251786240" behindDoc="0" locked="0" layoutInCell="1" allowOverlap="1" wp14:anchorId="7AC7A249" wp14:editId="0ABBAF78">
                 <wp:simplePos x="0" y="0"/>
                 <wp:positionH relativeFrom="margin">
                   <wp:align>left</wp:align>
@@ -44228,7 +44248,7 @@
                 <wp:positionV relativeFrom="paragraph">
                   <wp:posOffset>2526030</wp:posOffset>
                 </wp:positionV>
-                <wp:extent cx="1531620" cy="635"/>
+                <wp:extent cx="1600200" cy="635"/>
                 <wp:effectExtent l="0" t="0" r="0" b="0"/>
                 <wp:wrapTopAndBottom/>
                 <wp:docPr id="510413262" name="Textové pole 1"/>
@@ -44240,7 +44260,7 @@
                       <wps:spPr>
                         <a:xfrm>
                           <a:off x="0" y="0"/>
-                          <a:ext cx="1531620" cy="635"/>
+                          <a:ext cx="1600200" cy="635"/>
                         </a:xfrm>
                         <a:prstGeom prst="rect">
                           <a:avLst/>
@@ -44265,7 +44285,7 @@
                                 <w:szCs w:val="24"/>
                               </w:rPr>
                             </w:pPr>
-                            <w:bookmarkStart w:id="183" w:name="_Toc159173577"/>
+                            <w:bookmarkStart w:id="183" w:name="_Toc159952231"/>
                             <w:r>
                               <w:rPr>
                                 <w:i w:val="0"/>
@@ -44365,7 +44385,7 @@
           </mc:Choice>
           <mc:Fallback>
             <w:pict>
-              <v:shape w14:anchorId="7AC7A249" id="_x0000_s1054" type="#_x0000_t202" style="position:absolute;left:0;text-align:left;margin-left:0;margin-top:198.9pt;width:120.6pt;height:.05pt;z-index:251786240;visibility:visible;mso-wrap-style:square;mso-width-percent:0;mso-wrap-distance-left:9pt;mso-wrap-distance-top:0;mso-wrap-distance-right:9pt;mso-wrap-distance-bottom:0;mso-position-horizontal:left;mso-position-horizontal-relative:margin;mso-position-vertical:absolute;mso-position-vertical-relative:text;mso-width-percent:0;mso-width-relative:margin;v-text-anchor:top" o:gfxdata="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" stroked="f">
+              <v:shape w14:anchorId="7AC7A249" id="_x0000_s1054" type="#_x0000_t202" style="position:absolute;left:0;text-align:left;margin-left:0;margin-top:198.9pt;width:126pt;height:.05pt;z-index:251786240;visibility:visible;mso-wrap-style:square;mso-width-percent:0;mso-wrap-distance-left:9pt;mso-wrap-distance-top:0;mso-wrap-distance-right:9pt;mso-wrap-distance-bottom:0;mso-position-horizontal:left;mso-position-horizontal-relative:margin;mso-position-vertical:absolute;mso-position-vertical-relative:text;mso-width-percent:0;mso-width-relative:margin;v-text-anchor:top" o:gfxdata="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" stroked="f">
                 <v:textbox style="mso-fit-shape-to-text:t" inset="0,0,0,0">
                   <w:txbxContent>
                     <w:p>
@@ -44379,7 +44399,7 @@
                           <w:szCs w:val="24"/>
                         </w:rPr>
                       </w:pPr>
-                      <w:bookmarkStart w:id="184" w:name="_Toc159173577"/>
+                      <w:bookmarkStart w:id="184" w:name="_Toc159952231"/>
                       <w:r>
                         <w:rPr>
                           <w:i w:val="0"/>
@@ -44496,7 +44516,7 @@
                     <pic:cNvPicPr/>
                   </pic:nvPicPr>
                   <pic:blipFill>
-                    <a:blip r:embed="rId49">
+                    <a:blip r:embed="rId48">
                       <a:extLst>
                         <a:ext uri="{28A0092B-C50C-407E-A947-70E740481C1C}">
                           <a14:useLocalDpi xmlns:a14="http://schemas.microsoft.com/office/drawing/2010/main" val="0"/>
@@ -44580,7 +44600,7 @@
                                 <w:szCs w:val="24"/>
                               </w:rPr>
                             </w:pPr>
-                            <w:bookmarkStart w:id="185" w:name="_Toc159173578"/>
+                            <w:bookmarkStart w:id="185" w:name="_Toc159952232"/>
                             <w:r>
                               <w:rPr>
                                 <w:i w:val="0"/>
@@ -44691,7 +44711,7 @@
                           <w:szCs w:val="24"/>
                         </w:rPr>
                       </w:pPr>
-                      <w:bookmarkStart w:id="186" w:name="_Toc159173578"/>
+                      <w:bookmarkStart w:id="186" w:name="_Toc159952232"/>
                       <w:r>
                         <w:rPr>
                           <w:i w:val="0"/>
@@ -44808,7 +44828,7 @@
                     <pic:cNvPicPr/>
                   </pic:nvPicPr>
                   <pic:blipFill>
-                    <a:blip r:embed="rId50">
+                    <a:blip r:embed="rId49">
                       <a:extLst>
                         <a:ext uri="{28A0092B-C50C-407E-A947-70E740481C1C}">
                           <a14:useLocalDpi xmlns:a14="http://schemas.microsoft.com/office/drawing/2010/main" val="0"/>
@@ -44892,7 +44912,7 @@
                                 <w:szCs w:val="24"/>
                               </w:rPr>
                             </w:pPr>
-                            <w:bookmarkStart w:id="187" w:name="_Toc159173579"/>
+                            <w:bookmarkStart w:id="187" w:name="_Toc159952233"/>
                             <w:r>
                               <w:rPr>
                                 <w:i w:val="0"/>
@@ -45003,7 +45023,7 @@
                           <w:szCs w:val="24"/>
                         </w:rPr>
                       </w:pPr>
-                      <w:bookmarkStart w:id="188" w:name="_Toc159173579"/>
+                      <w:bookmarkStart w:id="188" w:name="_Toc159952233"/>
                       <w:r>
                         <w:rPr>
                           <w:i w:val="0"/>
@@ -45120,7 +45140,7 @@
                     <pic:cNvPicPr/>
                   </pic:nvPicPr>
                   <pic:blipFill>
-                    <a:blip r:embed="rId51">
+                    <a:blip r:embed="rId50">
                       <a:extLst>
                         <a:ext uri="{28A0092B-C50C-407E-A947-70E740481C1C}">
                           <a14:useLocalDpi xmlns:a14="http://schemas.microsoft.com/office/drawing/2010/main" val="0"/>
@@ -46374,7 +46394,7 @@
           <w:szCs w:val="20"/>
         </w:rPr>
       </w:pPr>
-      <w:bookmarkStart w:id="189" w:name="_Toc159173598"/>
+      <w:bookmarkStart w:id="189" w:name="_Toc159952200"/>
       <w:r>
         <w:rPr>
           <w:noProof/>
@@ -46427,7 +46447,7 @@
                                 <w:noProof/>
                               </w:rPr>
                             </w:pPr>
-                            <w:bookmarkStart w:id="190" w:name="_Toc159173580"/>
+                            <w:bookmarkStart w:id="190" w:name="_Toc159952234"/>
                             <w:r>
                               <w:rPr>
                                 <w:i w:val="0"/>
@@ -46536,7 +46556,7 @@
                           <w:noProof/>
                         </w:rPr>
                       </w:pPr>
-                      <w:bookmarkStart w:id="191" w:name="_Toc159173580"/>
+                      <w:bookmarkStart w:id="191" w:name="_Toc159952234"/>
                       <w:r>
                         <w:rPr>
                           <w:i w:val="0"/>
@@ -46655,7 +46675,7 @@
                     <pic:cNvPicPr/>
                   </pic:nvPicPr>
                   <pic:blipFill>
-                    <a:blip r:embed="rId52">
+                    <a:blip r:embed="rId51">
                       <a:extLst>
                         <a:ext uri="{28A0092B-C50C-407E-A947-70E740481C1C}">
                           <a14:useLocalDpi xmlns:a14="http://schemas.microsoft.com/office/drawing/2010/main" val="0"/>
@@ -46739,7 +46759,7 @@
                                 <w:noProof/>
                               </w:rPr>
                             </w:pPr>
-                            <w:bookmarkStart w:id="192" w:name="_Toc159173581"/>
+                            <w:bookmarkStart w:id="192" w:name="_Toc159952235"/>
                             <w:r>
                               <w:rPr>
                                 <w:i w:val="0"/>
@@ -46848,7 +46868,7 @@
                           <w:noProof/>
                         </w:rPr>
                       </w:pPr>
-                      <w:bookmarkStart w:id="193" w:name="_Toc159173581"/>
+                      <w:bookmarkStart w:id="193" w:name="_Toc159952235"/>
                       <w:r>
                         <w:rPr>
                           <w:i w:val="0"/>
@@ -46967,7 +46987,7 @@
                     <pic:cNvPicPr/>
                   </pic:nvPicPr>
                   <pic:blipFill>
-                    <a:blip r:embed="rId53">
+                    <a:blip r:embed="rId52">
                       <a:extLst>
                         <a:ext uri="{28A0092B-C50C-407E-A947-70E740481C1C}">
                           <a14:useLocalDpi xmlns:a14="http://schemas.microsoft.com/office/drawing/2010/main" val="0"/>
@@ -48288,7 +48308,7 @@
           <w:szCs w:val="20"/>
         </w:rPr>
       </w:pPr>
-      <w:bookmarkStart w:id="194" w:name="_Toc159173599"/>
+      <w:bookmarkStart w:id="194" w:name="_Toc159952201"/>
       <w:r>
         <w:rPr>
           <w:i w:val="0"/>
@@ -48421,7 +48441,7 @@
                                 <w:szCs w:val="24"/>
                               </w:rPr>
                             </w:pPr>
-                            <w:bookmarkStart w:id="195" w:name="_Toc159173582"/>
+                            <w:bookmarkStart w:id="195" w:name="_Toc159952236"/>
                             <w:r>
                               <w:rPr>
                                 <w:i w:val="0"/>
@@ -48532,7 +48552,7 @@
                           <w:szCs w:val="24"/>
                         </w:rPr>
                       </w:pPr>
-                      <w:bookmarkStart w:id="196" w:name="_Toc159173582"/>
+                      <w:bookmarkStart w:id="196" w:name="_Toc159952236"/>
                       <w:r>
                         <w:rPr>
                           <w:i w:val="0"/>
@@ -48649,7 +48669,7 @@
                     <pic:cNvPicPr/>
                   </pic:nvPicPr>
                   <pic:blipFill>
-                    <a:blip r:embed="rId54">
+                    <a:blip r:embed="rId53">
                       <a:extLst>
                         <a:ext uri="{28A0092B-C50C-407E-A947-70E740481C1C}">
                           <a14:useLocalDpi xmlns:a14="http://schemas.microsoft.com/office/drawing/2010/main" val="0"/>
@@ -48733,7 +48753,7 @@
                                 <w:szCs w:val="24"/>
                               </w:rPr>
                             </w:pPr>
-                            <w:bookmarkStart w:id="197" w:name="_Toc159173583"/>
+                            <w:bookmarkStart w:id="197" w:name="_Toc159952237"/>
                             <w:r>
                               <w:rPr>
                                 <w:i w:val="0"/>
@@ -48844,7 +48864,7 @@
                           <w:szCs w:val="24"/>
                         </w:rPr>
                       </w:pPr>
-                      <w:bookmarkStart w:id="198" w:name="_Toc159173583"/>
+                      <w:bookmarkStart w:id="198" w:name="_Toc159952237"/>
                       <w:r>
                         <w:rPr>
                           <w:i w:val="0"/>
@@ -48961,7 +48981,7 @@
                     <pic:cNvPicPr/>
                   </pic:nvPicPr>
                   <pic:blipFill>
-                    <a:blip r:embed="rId55">
+                    <a:blip r:embed="rId54">
                       <a:extLst>
                         <a:ext uri="{28A0092B-C50C-407E-A947-70E740481C1C}">
                           <a14:useLocalDpi xmlns:a14="http://schemas.microsoft.com/office/drawing/2010/main" val="0"/>
@@ -48996,11 +49016,10 @@
       <w:bookmarkEnd w:id="170"/>
     </w:p>
     <w:sectPr>
-      <w:headerReference w:type="default" r:id="rId56"/>
+      <w:headerReference w:type="default" r:id="rId55"/>
       <w:type w:val="continuous"/>
       <w:pgSz w:w="11907" w:h="16839" w:code="9"/>
       <w:pgMar w:top="1418" w:right="851" w:bottom="1418" w:left="1985" w:header="709" w:footer="709" w:gutter="0"/>
-      <w:pgNumType w:fmt="upperRoman" w:start="1"/>
       <w:cols w:space="708"/>
       <w:noEndnote/>
       <w:docGrid w:linePitch="326"/>
@@ -49546,25 +49565,9 @@
 
 <file path=word/footer1.xml><?xml version="1.0" encoding="utf-8"?>
 <w:ftr xmlns:wpc="http://schemas.microsoft.com/office/word/2010/wordprocessingCanvas" xmlns:cx="http://schemas.microsoft.com/office/drawing/2014/chartex" xmlns:cx1="http://schemas.microsoft.com/office/drawing/2015/9/8/chartex" xmlns:cx2="http://schemas.microsoft.com/office/drawing/2015/10/21/chartex" xmlns:cx3="http://schemas.microsoft.com/office/drawing/2016/5/9/chartex" xmlns:cx4="http://schemas.microsoft.com/office/drawing/2016/5/10/chartex" xmlns:cx5="http://schemas.microsoft.com/office/drawing/2016/5/11/chartex" xmlns:cx6="http://schemas.microsoft.com/office/drawing/2016/5/12/chartex" xmlns:cx7="http://schemas.microsoft.com/office/drawing/2016/5/13/chartex" xmlns:cx8="http://schemas.microsoft.com/office/drawing/2016/5/14/chartex" xmlns:mc="http://schemas.openxmlformats.org/markup-compatibility/2006" xmlns:aink="http://schemas.microsoft.com/office/drawing/2016/ink" xmlns:am3d="http://schemas.microsoft.com/office/drawing/2017/model3d" xmlns:o="urn:schemas-microsoft-com:office:office" xmlns:oel="http://schemas.microsoft.com/office/2019/extlst" xmlns:r="http://schemas.openxmlformats.org/officeDocument/2006/relationships" xmlns:m="http://schemas.openxmlformats.org/officeDocument/2006/math" xmlns:v="urn:schemas-microsoft-com:vml" xmlns:wp14="http://schemas.microsoft.com/office/word/2010/wordprocessingDrawing" xmlns:wp="http://schemas.openxmlformats.org/drawingml/2006/wordprocessingDrawing" xmlns:w10="urn:schemas-microsoft-com:office:word" xmlns:w="http://schemas.openxmlformats.org/wordprocessingml/2006/main" xmlns:w14="http://schemas.microsoft.com/office/word/2010/wordml" xmlns:w15="http://schemas.microsoft.com/office/word/2012/wordml" xmlns:w16cex="http://schemas.microsoft.com/office/word/2018/wordml/cex" xmlns:w16cid="http://schemas.microsoft.com/office/word/2016/wordml/cid" xmlns:w16="http://schemas.microsoft.com/office/word/2018/wordml" xmlns:w16sdtdh="http://schemas.microsoft.com/office/word/2020/wordml/sdtdatahash" xmlns:w16se="http://schemas.microsoft.com/office/word/2015/wordml/symex" xmlns:wpg="http://schemas.microsoft.com/office/word/2010/wordprocessingGroup" xmlns:wpi="http://schemas.microsoft.com/office/word/2010/wordprocessingInk" xmlns:wne="http://schemas.microsoft.com/office/word/2006/wordml" xmlns:wps="http://schemas.microsoft.com/office/word/2010/wordprocessingShape" mc:Ignorable="w14 w15 w16se w16cid w16 w16cex w16sdtdh wp14">
-  <w:p>
-    <w:pPr>
-      <w:pStyle w:val="Zpat"/>
-      <w:jc w:val="center"/>
-    </w:pPr>
-  </w:p>
-  <w:p>
-    <w:pPr>
-      <w:pStyle w:val="Zpat"/>
-    </w:pPr>
-  </w:p>
-</w:ftr>
-</file>
-
-<file path=word/footer2.xml><?xml version="1.0" encoding="utf-8"?>
-<w:ftr xmlns:wpc="http://schemas.microsoft.com/office/word/2010/wordprocessingCanvas" xmlns:cx="http://schemas.microsoft.com/office/drawing/2014/chartex" xmlns:cx1="http://schemas.microsoft.com/office/drawing/2015/9/8/chartex" xmlns:cx2="http://schemas.microsoft.com/office/drawing/2015/10/21/chartex" xmlns:cx3="http://schemas.microsoft.com/office/drawing/2016/5/9/chartex" xmlns:cx4="http://schemas.microsoft.com/office/drawing/2016/5/10/chartex" xmlns:cx5="http://schemas.microsoft.com/office/drawing/2016/5/11/chartex" xmlns:cx6="http://schemas.microsoft.com/office/drawing/2016/5/12/chartex" xmlns:cx7="http://schemas.microsoft.com/office/drawing/2016/5/13/chartex" xmlns:cx8="http://schemas.microsoft.com/office/drawing/2016/5/14/chartex" xmlns:mc="http://schemas.openxmlformats.org/markup-compatibility/2006" xmlns:aink="http://schemas.microsoft.com/office/drawing/2016/ink" xmlns:am3d="http://schemas.microsoft.com/office/drawing/2017/model3d" xmlns:o="urn:schemas-microsoft-com:office:office" xmlns:oel="http://schemas.microsoft.com/office/2019/extlst" xmlns:r="http://schemas.openxmlformats.org/officeDocument/2006/relationships" xmlns:m="http://schemas.openxmlformats.org/officeDocument/2006/math" xmlns:v="urn:schemas-microsoft-com:vml" xmlns:wp14="http://schemas.microsoft.com/office/word/2010/wordprocessingDrawing" xmlns:wp="http://schemas.openxmlformats.org/drawingml/2006/wordprocessingDrawing" xmlns:w10="urn:schemas-microsoft-com:office:word" xmlns:w="http://schemas.openxmlformats.org/wordprocessingml/2006/main" xmlns:w14="http://schemas.microsoft.com/office/word/2010/wordml" xmlns:w15="http://schemas.microsoft.com/office/word/2012/wordml" xmlns:w16cex="http://schemas.microsoft.com/office/word/2018/wordml/cex" xmlns:w16cid="http://schemas.microsoft.com/office/word/2016/wordml/cid" xmlns:w16="http://schemas.microsoft.com/office/word/2018/wordml" xmlns:w16sdtdh="http://schemas.microsoft.com/office/word/2020/wordml/sdtdatahash" xmlns:w16se="http://schemas.microsoft.com/office/word/2015/wordml/symex" xmlns:wpg="http://schemas.microsoft.com/office/word/2010/wordprocessingGroup" xmlns:wpi="http://schemas.microsoft.com/office/word/2010/wordprocessingInk" xmlns:wne="http://schemas.microsoft.com/office/word/2006/wordml" xmlns:wps="http://schemas.microsoft.com/office/word/2010/wordprocessingShape" mc:Ignorable="w14 w15 w16se w16cid w16 w16cex w16sdtdh wp14">
   <w:sdt>
     <w:sdtPr>
-      <w:id w:val="-954406742"/>
+      <w:id w:val="-786352489"/>
       <w:docPartObj>
         <w:docPartGallery w:val="Page Numbers (Bottom of Page)"/>
         <w:docPartUnique/>

</xml_diff>